<commit_message>
Report: team, supervisor, Times New Roman, fewer figures; add the mini project presentation
Co-Authored-By: Claude Sonnet 5.5 <noreply@anthropic.com>
</commit_message>
<xml_diff>
--- a/docs/TY_Mini_Project_Report.docx
+++ b/docs/TY_Mini_Project_Report.docx
@@ -106,9 +106,8 @@
         <w:rPr>
           <w:b/>
           <w:i w:val="0"/>
-          <w:highlight w:val="yellow"/>
         </w:rPr>
-        <w:t>[Student Name 1]</w:t>
+        <w:t>Jay Dhake  (A – 07)</w:t>
       </w:r>
     </w:p>
     <w:p>
@@ -120,9 +119,21 @@
         <w:rPr>
           <w:b/>
           <w:i w:val="0"/>
-          <w:highlight w:val="yellow"/>
         </w:rPr>
-        <w:t>[Student Name 2]</w:t>
+        <w:t>Samarth Ghanekar  (A – 10)</w:t>
+      </w:r>
+    </w:p>
+    <w:p>
+      <w:pPr>
+        <w:spacing w:after="200"/>
+        <w:jc w:val="center"/>
+      </w:pPr>
+      <w:r>
+        <w:rPr>
+          <w:b/>
+          <w:i w:val="0"/>
+        </w:rPr>
+        <w:t>Saahir Joshi  (A – 16)</w:t>
       </w:r>
     </w:p>
     <w:p>
@@ -148,9 +159,8 @@
           <w:b/>
           <w:i w:val="0"/>
           <w:sz w:val="22"/>
-          <w:highlight w:val="yellow"/>
         </w:rPr>
-        <w:t>[Supervisor Name]</w:t>
+        <w:t>Prof. Mrunali Desai</w:t>
       </w:r>
     </w:p>
     <w:p>
@@ -517,7 +527,7 @@
       <w:r>
         <w:t>5 Conclusion</w:t>
         <w:tab/>
-        <w:t>22</w:t>
+        <w:t>19</w:t>
       </w:r>
     </w:p>
     <w:p>
@@ -530,7 +540,7 @@
       <w:r>
         <w:t>References</w:t>
         <w:tab/>
-        <w:t>23</w:t>
+        <w:t>20</w:t>
       </w:r>
       <w:r>
         <w:fldChar w:fldCharType="end"/>
@@ -6486,116 +6496,8 @@
       <w:r>
         <w:drawing>
           <wp:inline xmlns:a="http://schemas.openxmlformats.org/drawingml/2006/main" xmlns:pic="http://schemas.openxmlformats.org/drawingml/2006/picture">
-            <wp:extent cx="5580000" cy="1994700"/>
+            <wp:extent cx="5580000" cy="3421941"/>
             <wp:docPr id="5" name="Picture 5"/>
-            <wp:cNvGraphicFramePr>
-              <a:graphicFrameLocks noChangeAspect="1"/>
-            </wp:cNvGraphicFramePr>
-            <a:graphic>
-              <a:graphicData uri="http://schemas.openxmlformats.org/drawingml/2006/picture">
-                <pic:pic>
-                  <pic:nvPicPr>
-                    <pic:cNvPr id="0" name="fig_hours.png"/>
-                    <pic:cNvPicPr/>
-                  </pic:nvPicPr>
-                  <pic:blipFill>
-                    <a:blip r:embed="rId14"/>
-                    <a:stretch>
-                      <a:fillRect/>
-                    </a:stretch>
-                  </pic:blipFill>
-                  <pic:spPr>
-                    <a:xfrm>
-                      <a:off x="0" y="0"/>
-                      <a:ext cx="5580000" cy="1994700"/>
-                    </a:xfrm>
-                    <a:prstGeom prst="rect"/>
-                  </pic:spPr>
-                </pic:pic>
-              </a:graphicData>
-            </a:graphic>
-          </wp:inline>
-        </w:drawing>
-      </w:r>
-    </w:p>
-    <w:p>
-      <w:pPr>
-        <w:spacing w:after="280"/>
-        <w:jc w:val="center"/>
-      </w:pPr>
-      <w:r>
-        <w:rPr>
-          <w:b/>
-          <w:sz w:val="20"/>
-        </w:rPr>
-        <w:t>Fig 4.2 Fraud and transaction volume by hour of the day</w:t>
-      </w:r>
-    </w:p>
-    <w:p>
-      <w:pPr>
-        <w:keepNext/>
-        <w:spacing w:after="80"/>
-        <w:jc w:val="center"/>
-      </w:pPr>
-      <w:r>
-        <w:drawing>
-          <wp:inline xmlns:a="http://schemas.openxmlformats.org/drawingml/2006/main" xmlns:pic="http://schemas.openxmlformats.org/drawingml/2006/picture">
-            <wp:extent cx="5580000" cy="3934946"/>
-            <wp:docPr id="6" name="Picture 6"/>
-            <wp:cNvGraphicFramePr>
-              <a:graphicFrameLocks noChangeAspect="1"/>
-            </wp:cNvGraphicFramePr>
-            <a:graphic>
-              <a:graphicData uri="http://schemas.openxmlformats.org/drawingml/2006/picture">
-                <pic:pic>
-                  <pic:nvPicPr>
-                    <pic:cNvPr id="0" name="fig_balance.png"/>
-                    <pic:cNvPicPr/>
-                  </pic:nvPicPr>
-                  <pic:blipFill>
-                    <a:blip r:embed="rId15"/>
-                    <a:stretch>
-                      <a:fillRect/>
-                    </a:stretch>
-                  </pic:blipFill>
-                  <pic:spPr>
-                    <a:xfrm>
-                      <a:off x="0" y="0"/>
-                      <a:ext cx="5580000" cy="3934946"/>
-                    </a:xfrm>
-                    <a:prstGeom prst="rect"/>
-                  </pic:spPr>
-                </pic:pic>
-              </a:graphicData>
-            </a:graphic>
-          </wp:inline>
-        </w:drawing>
-      </w:r>
-    </w:p>
-    <w:p>
-      <w:pPr>
-        <w:spacing w:after="280"/>
-        <w:jc w:val="center"/>
-      </w:pPr>
-      <w:r>
-        <w:rPr>
-          <w:b/>
-          <w:sz w:val="20"/>
-        </w:rPr>
-        <w:t>Fig 4.3 Behaviour of fraudulent transactions and receivers of repeated fraud</w:t>
-      </w:r>
-    </w:p>
-    <w:p>
-      <w:pPr>
-        <w:keepNext/>
-        <w:spacing w:after="80"/>
-        <w:jc w:val="center"/>
-      </w:pPr>
-      <w:r>
-        <w:drawing>
-          <wp:inline xmlns:a="http://schemas.openxmlformats.org/drawingml/2006/main" xmlns:pic="http://schemas.openxmlformats.org/drawingml/2006/picture">
-            <wp:extent cx="5580000" cy="3421941"/>
-            <wp:docPr id="7" name="Picture 7"/>
             <wp:cNvGraphicFramePr>
               <a:graphicFrameLocks noChangeAspect="1"/>
             </wp:cNvGraphicFramePr>
@@ -6607,7 +6509,7 @@
                     <pic:cNvPicPr/>
                   </pic:nvPicPr>
                   <pic:blipFill>
-                    <a:blip r:embed="rId16"/>
+                    <a:blip r:embed="rId14"/>
                     <a:stretch>
                       <a:fillRect/>
                     </a:stretch>
@@ -6636,115 +6538,7 @@
           <w:b/>
           <w:sz w:val="20"/>
         </w:rPr>
-        <w:t>Fig 4.4 Model comparison, confusion matrix, feature importance and threshold curve</w:t>
-      </w:r>
-    </w:p>
-    <w:p>
-      <w:pPr>
-        <w:keepNext/>
-        <w:spacing w:after="80"/>
-        <w:jc w:val="center"/>
-      </w:pPr>
-      <w:r>
-        <w:drawing>
-          <wp:inline xmlns:a="http://schemas.openxmlformats.org/drawingml/2006/main" xmlns:pic="http://schemas.openxmlformats.org/drawingml/2006/picture">
-            <wp:extent cx="5580000" cy="4425023"/>
-            <wp:docPr id="8" name="Picture 8"/>
-            <wp:cNvGraphicFramePr>
-              <a:graphicFrameLocks noChangeAspect="1"/>
-            </wp:cNvGraphicFramePr>
-            <a:graphic>
-              <a:graphicData uri="http://schemas.openxmlformats.org/drawingml/2006/picture">
-                <pic:pic>
-                  <pic:nvPicPr>
-                    <pic:cNvPr id="0" name="fig_flagged.png"/>
-                    <pic:cNvPicPr/>
-                  </pic:nvPicPr>
-                  <pic:blipFill>
-                    <a:blip r:embed="rId17"/>
-                    <a:stretch>
-                      <a:fillRect/>
-                    </a:stretch>
-                  </pic:blipFill>
-                  <pic:spPr>
-                    <a:xfrm>
-                      <a:off x="0" y="0"/>
-                      <a:ext cx="5580000" cy="4425023"/>
-                    </a:xfrm>
-                    <a:prstGeom prst="rect"/>
-                  </pic:spPr>
-                </pic:pic>
-              </a:graphicData>
-            </a:graphic>
-          </wp:inline>
-        </w:drawing>
-      </w:r>
-    </w:p>
-    <w:p>
-      <w:pPr>
-        <w:spacing w:after="280"/>
-        <w:jc w:val="center"/>
-      </w:pPr>
-      <w:r>
-        <w:rPr>
-          <w:b/>
-          <w:sz w:val="20"/>
-        </w:rPr>
-        <w:t>Fig 4.5 Flagged transactions of the test set with their outcome</w:t>
-      </w:r>
-    </w:p>
-    <w:p>
-      <w:pPr>
-        <w:keepNext/>
-        <w:spacing w:after="80"/>
-        <w:jc w:val="center"/>
-      </w:pPr>
-      <w:r>
-        <w:drawing>
-          <wp:inline xmlns:a="http://schemas.openxmlformats.org/drawingml/2006/main" xmlns:pic="http://schemas.openxmlformats.org/drawingml/2006/picture">
-            <wp:extent cx="5580000" cy="1665116"/>
-            <wp:docPr id="9" name="Picture 9"/>
-            <wp:cNvGraphicFramePr>
-              <a:graphicFrameLocks noChangeAspect="1"/>
-            </wp:cNvGraphicFramePr>
-            <a:graphic>
-              <a:graphicData uri="http://schemas.openxmlformats.org/drawingml/2006/picture">
-                <pic:pic>
-                  <pic:nvPicPr>
-                    <pic:cNvPr id="0" name="fig_predict.png"/>
-                    <pic:cNvPicPr/>
-                  </pic:nvPicPr>
-                  <pic:blipFill>
-                    <a:blip r:embed="rId18"/>
-                    <a:stretch>
-                      <a:fillRect/>
-                    </a:stretch>
-                  </pic:blipFill>
-                  <pic:spPr>
-                    <a:xfrm>
-                      <a:off x="0" y="0"/>
-                      <a:ext cx="5580000" cy="1665116"/>
-                    </a:xfrm>
-                    <a:prstGeom prst="rect"/>
-                  </pic:spPr>
-                </pic:pic>
-              </a:graphicData>
-            </a:graphic>
-          </wp:inline>
-        </w:drawing>
-      </w:r>
-    </w:p>
-    <w:p>
-      <w:pPr>
-        <w:spacing w:after="280"/>
-        <w:jc w:val="center"/>
-      </w:pPr>
-      <w:r>
-        <w:rPr>
-          <w:b/>
-          <w:sz w:val="20"/>
-        </w:rPr>
-        <w:t>Fig 4.6 Scoring a single transaction</w:t>
+        <w:t>Fig 4.2 Model comparison, confusion matrix, feature importance and threshold curve</w:t>
       </w:r>
     </w:p>
     <w:p>
@@ -6757,7 +6551,7 @@
         <w:drawing>
           <wp:inline xmlns:a="http://schemas.openxmlformats.org/drawingml/2006/main" xmlns:pic="http://schemas.openxmlformats.org/drawingml/2006/picture">
             <wp:extent cx="5580000" cy="2614348"/>
-            <wp:docPr id="10" name="Picture 10"/>
+            <wp:docPr id="6" name="Picture 6"/>
             <wp:cNvGraphicFramePr>
               <a:graphicFrameLocks noChangeAspect="1"/>
             </wp:cNvGraphicFramePr>
@@ -6769,7 +6563,7 @@
                     <pic:cNvPicPr/>
                   </pic:nvPicPr>
                   <pic:blipFill>
-                    <a:blip r:embed="rId19"/>
+                    <a:blip r:embed="rId15"/>
                     <a:stretch>
                       <a:fillRect/>
                     </a:stretch>
@@ -6798,7 +6592,7 @@
           <w:b/>
           <w:sz w:val="20"/>
         </w:rPr>
-        <w:t>Fig 4.7 Explorer: matching accounts appear while the account id is typed</w:t>
+        <w:t>Fig 4.3 Explorer: matching accounts appear while the account id is typed</w:t>
       </w:r>
     </w:p>
     <w:p>
@@ -6811,7 +6605,7 @@
         <w:drawing>
           <wp:inline xmlns:a="http://schemas.openxmlformats.org/drawingml/2006/main" xmlns:pic="http://schemas.openxmlformats.org/drawingml/2006/picture">
             <wp:extent cx="5580000" cy="3186934"/>
-            <wp:docPr id="11" name="Picture 11"/>
+            <wp:docPr id="7" name="Picture 7"/>
             <wp:cNvGraphicFramePr>
               <a:graphicFrameLocks noChangeAspect="1"/>
             </wp:cNvGraphicFramePr>
@@ -6823,7 +6617,7 @@
                     <pic:cNvPicPr/>
                   </pic:nvPicPr>
                   <pic:blipFill>
-                    <a:blip r:embed="rId20"/>
+                    <a:blip r:embed="rId16"/>
                     <a:stretch>
                       <a:fillRect/>
                     </a:stretch>
@@ -6852,7 +6646,7 @@
           <w:b/>
           <w:sz w:val="20"/>
         </w:rPr>
-        <w:t>Fig 4.8 Explorer: account summary, transactions and transaction detail with the model score</w:t>
+        <w:t>Fig 4.4 Explorer: account summary, transactions and transaction detail with the model score</w:t>
       </w:r>
     </w:p>
     <w:p>
@@ -6865,7 +6659,7 @@
         <w:drawing>
           <wp:inline xmlns:a="http://schemas.openxmlformats.org/drawingml/2006/main" xmlns:pic="http://schemas.openxmlformats.org/drawingml/2006/picture">
             <wp:extent cx="5580000" cy="4691556"/>
-            <wp:docPr id="12" name="Picture 12"/>
+            <wp:docPr id="8" name="Picture 8"/>
             <wp:cNvGraphicFramePr>
               <a:graphicFrameLocks noChangeAspect="1"/>
             </wp:cNvGraphicFramePr>
@@ -6877,7 +6671,7 @@
                     <pic:cNvPicPr/>
                   </pic:nvPicPr>
                   <pic:blipFill>
-                    <a:blip r:embed="rId21"/>
+                    <a:blip r:embed="rId17"/>
                     <a:stretch>
                       <a:fillRect/>
                     </a:stretch>
@@ -6906,7 +6700,7 @@
           <w:b/>
           <w:sz w:val="20"/>
         </w:rPr>
-        <w:t>Fig 4.9 Case management: list, status counts and the detail of a case being worked</w:t>
+        <w:t>Fig 4.5 Case management: list, status counts and the detail of a case being worked</w:t>
       </w:r>
     </w:p>
     <w:p>
@@ -6919,7 +6713,7 @@
         <w:drawing>
           <wp:inline xmlns:a="http://schemas.openxmlformats.org/drawingml/2006/main" xmlns:pic="http://schemas.openxmlformats.org/drawingml/2006/picture">
             <wp:extent cx="5580000" cy="4571186"/>
-            <wp:docPr id="13" name="Picture 13"/>
+            <wp:docPr id="9" name="Picture 9"/>
             <wp:cNvGraphicFramePr>
               <a:graphicFrameLocks noChangeAspect="1"/>
             </wp:cNvGraphicFramePr>
@@ -6931,7 +6725,7 @@
                     <pic:cNvPicPr/>
                   </pic:nvPicPr>
                   <pic:blipFill>
-                    <a:blip r:embed="rId22"/>
+                    <a:blip r:embed="rId18"/>
                     <a:stretch>
                       <a:fillRect/>
                     </a:stretch>
@@ -6960,61 +6754,7 @@
           <w:b/>
           <w:sz w:val="20"/>
         </w:rPr>
-        <w:t>Fig 4.10 Upload: result of scoring an 8-million-row file with accuracy against its labels</w:t>
-      </w:r>
-    </w:p>
-    <w:p>
-      <w:pPr>
-        <w:keepNext/>
-        <w:spacing w:after="80"/>
-        <w:jc w:val="center"/>
-      </w:pPr>
-      <w:r>
-        <w:drawing>
-          <wp:inline xmlns:a="http://schemas.openxmlformats.org/drawingml/2006/main" xmlns:pic="http://schemas.openxmlformats.org/drawingml/2006/picture">
-            <wp:extent cx="3792256" cy="7379999"/>
-            <wp:docPr id="14" name="Picture 14"/>
-            <wp:cNvGraphicFramePr>
-              <a:graphicFrameLocks noChangeAspect="1"/>
-            </wp:cNvGraphicFramePr>
-            <a:graphic>
-              <a:graphicData uri="http://schemas.openxmlformats.org/drawingml/2006/picture">
-                <pic:pic>
-                  <pic:nvPicPr>
-                    <pic:cNvPr id="0" name="fig_upload_overview.png"/>
-                    <pic:cNvPicPr/>
-                  </pic:nvPicPr>
-                  <pic:blipFill>
-                    <a:blip r:embed="rId23"/>
-                    <a:stretch>
-                      <a:fillRect/>
-                    </a:stretch>
-                  </pic:blipFill>
-                  <pic:spPr>
-                    <a:xfrm>
-                      <a:off x="0" y="0"/>
-                      <a:ext cx="3792256" cy="7379999"/>
-                    </a:xfrm>
-                    <a:prstGeom prst="rect"/>
-                  </pic:spPr>
-                </pic:pic>
-              </a:graphicData>
-            </a:graphic>
-          </wp:inline>
-        </w:drawing>
-      </w:r>
-    </w:p>
-    <w:p>
-      <w:pPr>
-        <w:spacing w:after="280"/>
-        <w:jc w:val="center"/>
-      </w:pPr>
-      <w:r>
-        <w:rPr>
-          <w:b/>
-          <w:sz w:val="20"/>
-        </w:rPr>
-        <w:t>Fig 4.11 Overview computed for the uploaded file</w:t>
+        <w:t>Fig 4.6 Upload: result of scoring an 8-million-row file with accuracy against its labels</w:t>
       </w:r>
     </w:p>
     <w:p>
@@ -7295,21 +7035,21 @@
     </w:pPr>
     <w:r>
       <w:rPr>
-        <w:rFonts w:ascii="Arial" w:hAnsi="Arial"/>
+        <w:rFonts w:ascii="Times New Roman" w:hAnsi="Times New Roman"/>
         <w:sz w:val="22"/>
       </w:rPr>
       <w:fldChar w:fldCharType="begin"/>
     </w:r>
     <w:r>
       <w:rPr>
-        <w:rFonts w:ascii="Arial" w:hAnsi="Arial"/>
+        <w:rFonts w:ascii="Times New Roman" w:hAnsi="Times New Roman"/>
         <w:sz w:val="22"/>
       </w:rPr>
       <w:instrText xml:space="preserve">PAGE</w:instrText>
     </w:r>
     <w:r>
       <w:rPr>
-        <w:rFonts w:ascii="Arial" w:hAnsi="Arial"/>
+        <w:rFonts w:ascii="Times New Roman" w:hAnsi="Times New Roman"/>
         <w:sz w:val="22"/>
       </w:rPr>
       <w:fldChar w:fldCharType="end"/>
@@ -7526,7 +7266,7 @@
   <w:docDefaults>
     <w:rPrDefault>
       <w:rPr>
-        <w:rFonts w:asciiTheme="minorHAnsi" w:eastAsiaTheme="minorEastAsia" w:hAnsiTheme="minorHAnsi" w:cstheme="minorBidi"/>
+        <w:rFonts w:ascii="Times New Roman" w:hAnsi="Times New Roman" w:eastAsia="Times New Roman" w:cs="Times New Roman"/>
         <w:sz w:val="22"/>
         <w:szCs w:val="22"/>
         <w:lang w:val="en-US" w:eastAsia="en-US" w:bidi="ar-SA"/>
@@ -7704,6 +7444,9 @@
       </w:tabs>
       <w:spacing w:after="0" w:line="240" w:lineRule="auto"/>
     </w:pPr>
+    <w:rPr>
+      <w:rFonts w:ascii="Times New Roman" w:hAnsi="Times New Roman"/>
+    </w:rPr>
   </w:style>
   <w:style w:type="character" w:customStyle="1" w:styleId="HeaderChar">
     <w:name w:val="Header Char"/>
@@ -7711,6 +7454,9 @@
     <w:link w:val="Header"/>
     <w:uiPriority w:val="99"/>
     <w:rsid w:val="00E618BF"/>
+    <w:rPr>
+      <w:rFonts w:ascii="Times New Roman" w:hAnsi="Times New Roman"/>
+    </w:rPr>
   </w:style>
   <w:style w:type="paragraph" w:styleId="Footer">
     <w:name w:val="footer"/>
@@ -7726,6 +7472,9 @@
       </w:tabs>
       <w:spacing w:after="0" w:line="240" w:lineRule="auto"/>
     </w:pPr>
+    <w:rPr>
+      <w:rFonts w:ascii="Times New Roman" w:hAnsi="Times New Roman"/>
+    </w:rPr>
   </w:style>
   <w:style w:type="character" w:customStyle="1" w:styleId="FooterChar">
     <w:name w:val="Footer Char"/>
@@ -7733,6 +7482,9 @@
     <w:link w:val="Footer"/>
     <w:uiPriority w:val="99"/>
     <w:rsid w:val="00E618BF"/>
+    <w:rPr>
+      <w:rFonts w:ascii="Times New Roman" w:hAnsi="Times New Roman"/>
+    </w:rPr>
   </w:style>
   <w:style w:type="paragraph" w:styleId="Heading1">
     <w:name w:val="heading 1"/>
@@ -7750,7 +7502,7 @@
       <w:outlineLvl w:val="0"/>
     </w:pPr>
     <w:rPr>
-      <w:rFonts w:asciiTheme="majorHAnsi" w:eastAsiaTheme="majorEastAsia" w:hAnsiTheme="majorHAnsi" w:cstheme="majorBidi" w:ascii="Times New Roman" w:hAnsi="Times New Roman" w:eastAsia="Times New Roman" w:cs="Times New Roman"/>
+      <w:rFonts w:ascii="Times New Roman" w:hAnsi="Times New Roman" w:eastAsia="Times New Roman" w:cs="Times New Roman"/>
       <w:b/>
       <w:bCs/>
       <w:i w:val="0"/>
@@ -7775,7 +7527,7 @@
       <w:outlineLvl w:val="1"/>
     </w:pPr>
     <w:rPr>
-      <w:rFonts w:asciiTheme="majorHAnsi" w:eastAsiaTheme="majorEastAsia" w:hAnsiTheme="majorHAnsi" w:cstheme="majorBidi" w:ascii="Times New Roman" w:hAnsi="Times New Roman" w:eastAsia="Times New Roman" w:cs="Times New Roman"/>
+      <w:rFonts w:ascii="Times New Roman" w:hAnsi="Times New Roman" w:eastAsia="Times New Roman" w:cs="Times New Roman"/>
       <w:b/>
       <w:bCs/>
       <w:i w:val="0"/>
@@ -7800,7 +7552,7 @@
       <w:outlineLvl w:val="2"/>
     </w:pPr>
     <w:rPr>
-      <w:rFonts w:asciiTheme="majorHAnsi" w:eastAsiaTheme="majorEastAsia" w:hAnsiTheme="majorHAnsi" w:cstheme="majorBidi" w:ascii="Times New Roman" w:hAnsi="Times New Roman" w:eastAsia="Times New Roman" w:cs="Times New Roman"/>
+      <w:rFonts w:ascii="Times New Roman" w:hAnsi="Times New Roman" w:eastAsia="Times New Roman" w:cs="Times New Roman"/>
       <w:b/>
       <w:bCs/>
       <w:i w:val="0"/>
@@ -7824,7 +7576,7 @@
       <w:outlineLvl w:val="3"/>
     </w:pPr>
     <w:rPr>
-      <w:rFonts w:asciiTheme="majorHAnsi" w:eastAsiaTheme="majorEastAsia" w:hAnsiTheme="majorHAnsi" w:cstheme="majorBidi"/>
+      <w:rFonts w:ascii="Times New Roman" w:hAnsi="Times New Roman" w:eastAsia="Times New Roman" w:cs="Times New Roman"/>
       <w:b/>
       <w:bCs/>
       <w:i/>
@@ -7849,7 +7601,7 @@
       <w:outlineLvl w:val="4"/>
     </w:pPr>
     <w:rPr>
-      <w:rFonts w:asciiTheme="majorHAnsi" w:eastAsiaTheme="majorEastAsia" w:hAnsiTheme="majorHAnsi" w:cstheme="majorBidi"/>
+      <w:rFonts w:ascii="Times New Roman" w:hAnsi="Times New Roman" w:eastAsia="Times New Roman" w:cs="Times New Roman"/>
       <w:color w:val="243F60" w:themeColor="accent1" w:themeShade="7F"/>
     </w:rPr>
   </w:style>
@@ -7870,7 +7622,7 @@
       <w:outlineLvl w:val="5"/>
     </w:pPr>
     <w:rPr>
-      <w:rFonts w:asciiTheme="majorHAnsi" w:eastAsiaTheme="majorEastAsia" w:hAnsiTheme="majorHAnsi" w:cstheme="majorBidi"/>
+      <w:rFonts w:ascii="Times New Roman" w:hAnsi="Times New Roman" w:eastAsia="Times New Roman" w:cs="Times New Roman"/>
       <w:i/>
       <w:iCs/>
       <w:color w:val="243F60" w:themeColor="accent1" w:themeShade="7F"/>
@@ -7893,7 +7645,7 @@
       <w:outlineLvl w:val="6"/>
     </w:pPr>
     <w:rPr>
-      <w:rFonts w:asciiTheme="majorHAnsi" w:eastAsiaTheme="majorEastAsia" w:hAnsiTheme="majorHAnsi" w:cstheme="majorBidi"/>
+      <w:rFonts w:ascii="Times New Roman" w:hAnsi="Times New Roman" w:eastAsia="Times New Roman" w:cs="Times New Roman"/>
       <w:i/>
       <w:iCs/>
       <w:color w:val="404040" w:themeColor="text1" w:themeTint="BF"/>
@@ -7916,7 +7668,7 @@
       <w:outlineLvl w:val="7"/>
     </w:pPr>
     <w:rPr>
-      <w:rFonts w:asciiTheme="majorHAnsi" w:eastAsiaTheme="majorEastAsia" w:hAnsiTheme="majorHAnsi" w:cstheme="majorBidi"/>
+      <w:rFonts w:ascii="Times New Roman" w:hAnsi="Times New Roman" w:eastAsia="Times New Roman" w:cs="Times New Roman"/>
       <w:color w:val="4F81BD" w:themeColor="accent1"/>
       <w:sz w:val="20"/>
       <w:szCs w:val="20"/>
@@ -7939,7 +7691,7 @@
       <w:outlineLvl w:val="8"/>
     </w:pPr>
     <w:rPr>
-      <w:rFonts w:asciiTheme="majorHAnsi" w:eastAsiaTheme="majorEastAsia" w:hAnsiTheme="majorHAnsi" w:cstheme="majorBidi"/>
+      <w:rFonts w:ascii="Times New Roman" w:hAnsi="Times New Roman" w:eastAsia="Times New Roman" w:cs="Times New Roman"/>
       <w:i/>
       <w:iCs/>
       <w:color w:val="404040" w:themeColor="text1" w:themeTint="BF"/>
@@ -7952,6 +7704,9 @@
     <w:uiPriority w:val="1"/>
     <w:semiHidden/>
     <w:unhideWhenUsed/>
+    <w:rPr>
+      <w:rFonts w:ascii="Times New Roman" w:hAnsi="Times New Roman"/>
+    </w:rPr>
   </w:style>
   <w:style w:type="table" w:default="1" w:styleId="TableNormal">
     <w:name w:val="Normal Table"/>
@@ -7982,6 +7737,9 @@
     <w:pPr>
       <w:spacing w:after="0" w:line="240" w:lineRule="auto"/>
     </w:pPr>
+    <w:rPr>
+      <w:rFonts w:ascii="Times New Roman" w:hAnsi="Times New Roman"/>
+    </w:rPr>
   </w:style>
   <w:style w:type="character" w:customStyle="1" w:styleId="Heading1Char">
     <w:name w:val="Heading 1 Char"/>
@@ -7990,7 +7748,7 @@
     <w:uiPriority w:val="9"/>
     <w:rsid w:val="00FC693F"/>
     <w:rPr>
-      <w:rFonts w:asciiTheme="majorHAnsi" w:eastAsiaTheme="majorEastAsia" w:hAnsiTheme="majorHAnsi" w:cstheme="majorBidi"/>
+      <w:rFonts w:ascii="Times New Roman" w:hAnsi="Times New Roman" w:eastAsia="Times New Roman" w:cs="Times New Roman"/>
       <w:b/>
       <w:bCs/>
       <w:color w:val="365F91" w:themeColor="accent1" w:themeShade="BF"/>
@@ -8005,7 +7763,7 @@
     <w:uiPriority w:val="9"/>
     <w:rsid w:val="00FC693F"/>
     <w:rPr>
-      <w:rFonts w:asciiTheme="majorHAnsi" w:eastAsiaTheme="majorEastAsia" w:hAnsiTheme="majorHAnsi" w:cstheme="majorBidi"/>
+      <w:rFonts w:ascii="Times New Roman" w:hAnsi="Times New Roman" w:eastAsia="Times New Roman" w:cs="Times New Roman"/>
       <w:b/>
       <w:bCs/>
       <w:color w:val="4F81BD" w:themeColor="accent1"/>
@@ -8020,7 +7778,7 @@
     <w:uiPriority w:val="9"/>
     <w:rsid w:val="00FC693F"/>
     <w:rPr>
-      <w:rFonts w:asciiTheme="majorHAnsi" w:eastAsiaTheme="majorEastAsia" w:hAnsiTheme="majorHAnsi" w:cstheme="majorBidi"/>
+      <w:rFonts w:ascii="Times New Roman" w:hAnsi="Times New Roman" w:eastAsia="Times New Roman" w:cs="Times New Roman"/>
       <w:b/>
       <w:bCs/>
       <w:color w:val="4F81BD" w:themeColor="accent1"/>
@@ -8042,7 +7800,7 @@
       <w:contextualSpacing/>
     </w:pPr>
     <w:rPr>
-      <w:rFonts w:asciiTheme="majorHAnsi" w:eastAsiaTheme="majorEastAsia" w:hAnsiTheme="majorHAnsi" w:cstheme="majorBidi"/>
+      <w:rFonts w:ascii="Times New Roman" w:hAnsi="Times New Roman" w:eastAsia="Times New Roman" w:cs="Times New Roman"/>
       <w:color w:val="17365D" w:themeColor="text2" w:themeShade="BF"/>
       <w:spacing w:val="5"/>
       <w:kern w:val="28"/>
@@ -8057,7 +7815,7 @@
     <w:uiPriority w:val="10"/>
     <w:rsid w:val="00FC693F"/>
     <w:rPr>
-      <w:rFonts w:asciiTheme="majorHAnsi" w:eastAsiaTheme="majorEastAsia" w:hAnsiTheme="majorHAnsi" w:cstheme="majorBidi"/>
+      <w:rFonts w:ascii="Times New Roman" w:hAnsi="Times New Roman" w:eastAsia="Times New Roman" w:cs="Times New Roman"/>
       <w:color w:val="17365D" w:themeColor="text2" w:themeShade="BF"/>
       <w:spacing w:val="5"/>
       <w:kern w:val="28"/>
@@ -8079,7 +7837,7 @@
       </w:numPr>
     </w:pPr>
     <w:rPr>
-      <w:rFonts w:asciiTheme="majorHAnsi" w:eastAsiaTheme="majorEastAsia" w:hAnsiTheme="majorHAnsi" w:cstheme="majorBidi"/>
+      <w:rFonts w:ascii="Times New Roman" w:hAnsi="Times New Roman" w:eastAsia="Times New Roman" w:cs="Times New Roman"/>
       <w:i/>
       <w:iCs/>
       <w:color w:val="4F81BD" w:themeColor="accent1"/>
@@ -8095,7 +7853,7 @@
     <w:uiPriority w:val="11"/>
     <w:rsid w:val="00FC693F"/>
     <w:rPr>
-      <w:rFonts w:asciiTheme="majorHAnsi" w:eastAsiaTheme="majorEastAsia" w:hAnsiTheme="majorHAnsi" w:cstheme="majorBidi"/>
+      <w:rFonts w:ascii="Times New Roman" w:hAnsi="Times New Roman" w:eastAsia="Times New Roman" w:cs="Times New Roman"/>
       <w:i/>
       <w:iCs/>
       <w:color w:val="4F81BD" w:themeColor="accent1"/>
@@ -8114,6 +7872,9 @@
       <w:ind w:left="720"/>
       <w:contextualSpacing/>
     </w:pPr>
+    <w:rPr>
+      <w:rFonts w:ascii="Times New Roman" w:hAnsi="Times New Roman"/>
+    </w:rPr>
   </w:style>
   <w:style w:type="paragraph" w:styleId="BodyText">
     <w:name w:val="Body Text"/>
@@ -8125,6 +7886,9 @@
     <w:pPr>
       <w:spacing w:after="120"/>
     </w:pPr>
+    <w:rPr>
+      <w:rFonts w:ascii="Times New Roman" w:hAnsi="Times New Roman"/>
+    </w:rPr>
   </w:style>
   <w:style w:type="character" w:customStyle="1" w:styleId="BodyTextChar">
     <w:name w:val="Body Text Char"/>
@@ -8132,6 +7896,9 @@
     <w:link w:val="BodyText"/>
     <w:uiPriority w:val="99"/>
     <w:rsid w:val="00AA1D8D"/>
+    <w:rPr>
+      <w:rFonts w:ascii="Times New Roman" w:hAnsi="Times New Roman"/>
+    </w:rPr>
   </w:style>
   <w:style w:type="paragraph" w:styleId="BodyText2">
     <w:name w:val="Body Text 2"/>
@@ -8143,6 +7910,9 @@
     <w:pPr>
       <w:spacing w:after="120" w:line="480" w:lineRule="auto"/>
     </w:pPr>
+    <w:rPr>
+      <w:rFonts w:ascii="Times New Roman" w:hAnsi="Times New Roman"/>
+    </w:rPr>
   </w:style>
   <w:style w:type="character" w:customStyle="1" w:styleId="BodyText2Char">
     <w:name w:val="Body Text 2 Char"/>
@@ -8150,6 +7920,9 @@
     <w:link w:val="BodyText2"/>
     <w:uiPriority w:val="99"/>
     <w:rsid w:val="00AA1D8D"/>
+    <w:rPr>
+      <w:rFonts w:ascii="Times New Roman" w:hAnsi="Times New Roman"/>
+    </w:rPr>
   </w:style>
   <w:style w:type="paragraph" w:styleId="BodyText3">
     <w:name w:val="Body Text 3"/>
@@ -8162,6 +7935,7 @@
       <w:spacing w:after="120"/>
     </w:pPr>
     <w:rPr>
+      <w:rFonts w:ascii="Times New Roman" w:hAnsi="Times New Roman"/>
       <w:sz w:val="16"/>
       <w:szCs w:val="16"/>
     </w:rPr>
@@ -8173,6 +7947,7 @@
     <w:uiPriority w:val="99"/>
     <w:rsid w:val="00AA1D8D"/>
     <w:rPr>
+      <w:rFonts w:ascii="Times New Roman" w:hAnsi="Times New Roman"/>
       <w:sz w:val="16"/>
       <w:szCs w:val="16"/>
     </w:rPr>
@@ -8187,6 +7962,9 @@
       <w:ind w:left="360" w:hanging="360"/>
       <w:contextualSpacing/>
     </w:pPr>
+    <w:rPr>
+      <w:rFonts w:ascii="Times New Roman" w:hAnsi="Times New Roman"/>
+    </w:rPr>
   </w:style>
   <w:style w:type="paragraph" w:styleId="List2">
     <w:name w:val="List 2"/>
@@ -8198,6 +7976,9 @@
       <w:ind w:left="720" w:hanging="360"/>
       <w:contextualSpacing/>
     </w:pPr>
+    <w:rPr>
+      <w:rFonts w:ascii="Times New Roman" w:hAnsi="Times New Roman"/>
+    </w:rPr>
   </w:style>
   <w:style w:type="paragraph" w:styleId="List3">
     <w:name w:val="List 3"/>
@@ -8209,6 +7990,9 @@
       <w:ind w:left="1080" w:hanging="360"/>
       <w:contextualSpacing/>
     </w:pPr>
+    <w:rPr>
+      <w:rFonts w:ascii="Times New Roman" w:hAnsi="Times New Roman"/>
+    </w:rPr>
   </w:style>
   <w:style w:type="paragraph" w:styleId="ListBullet">
     <w:name w:val="List Bullet"/>
@@ -8222,6 +8006,9 @@
       </w:numPr>
       <w:contextualSpacing/>
     </w:pPr>
+    <w:rPr>
+      <w:rFonts w:ascii="Times New Roman" w:hAnsi="Times New Roman"/>
+    </w:rPr>
   </w:style>
   <w:style w:type="paragraph" w:styleId="ListBullet2">
     <w:name w:val="List Bullet 2"/>
@@ -8235,6 +8022,9 @@
       </w:numPr>
       <w:contextualSpacing/>
     </w:pPr>
+    <w:rPr>
+      <w:rFonts w:ascii="Times New Roman" w:hAnsi="Times New Roman"/>
+    </w:rPr>
   </w:style>
   <w:style w:type="paragraph" w:styleId="ListBullet3">
     <w:name w:val="List Bullet 3"/>
@@ -8248,6 +8038,9 @@
       </w:numPr>
       <w:contextualSpacing/>
     </w:pPr>
+    <w:rPr>
+      <w:rFonts w:ascii="Times New Roman" w:hAnsi="Times New Roman"/>
+    </w:rPr>
   </w:style>
   <w:style w:type="paragraph" w:styleId="ListNumber">
     <w:name w:val="List Number"/>
@@ -8261,6 +8054,9 @@
       </w:numPr>
       <w:contextualSpacing/>
     </w:pPr>
+    <w:rPr>
+      <w:rFonts w:ascii="Times New Roman" w:hAnsi="Times New Roman"/>
+    </w:rPr>
   </w:style>
   <w:style w:type="paragraph" w:styleId="ListNumber2">
     <w:name w:val="List Number 2"/>
@@ -8274,6 +8070,9 @@
       </w:numPr>
       <w:contextualSpacing/>
     </w:pPr>
+    <w:rPr>
+      <w:rFonts w:ascii="Times New Roman" w:hAnsi="Times New Roman"/>
+    </w:rPr>
   </w:style>
   <w:style w:type="paragraph" w:styleId="ListNumber3">
     <w:name w:val="List Number 3"/>
@@ -8287,6 +8086,9 @@
       </w:numPr>
       <w:contextualSpacing/>
     </w:pPr>
+    <w:rPr>
+      <w:rFonts w:ascii="Times New Roman" w:hAnsi="Times New Roman"/>
+    </w:rPr>
   </w:style>
   <w:style w:type="paragraph" w:styleId="ListContinue">
     <w:name w:val="List Continue"/>
@@ -8299,6 +8101,9 @@
       <w:ind w:left="360"/>
       <w:contextualSpacing/>
     </w:pPr>
+    <w:rPr>
+      <w:rFonts w:ascii="Times New Roman" w:hAnsi="Times New Roman"/>
+    </w:rPr>
   </w:style>
   <w:style w:type="paragraph" w:styleId="ListContinue2">
     <w:name w:val="List Continue 2"/>
@@ -8311,6 +8116,9 @@
       <w:ind w:left="720"/>
       <w:contextualSpacing/>
     </w:pPr>
+    <w:rPr>
+      <w:rFonts w:ascii="Times New Roman" w:hAnsi="Times New Roman"/>
+    </w:rPr>
   </w:style>
   <w:style w:type="paragraph" w:styleId="ListContinue3">
     <w:name w:val="List Continue 3"/>
@@ -8323,6 +8131,9 @@
       <w:ind w:left="1080"/>
       <w:contextualSpacing/>
     </w:pPr>
+    <w:rPr>
+      <w:rFonts w:ascii="Times New Roman" w:hAnsi="Times New Roman"/>
+    </w:rPr>
   </w:style>
   <w:style w:type="paragraph" w:styleId="MacroText">
     <w:name w:val="macro"/>
@@ -8342,7 +8153,7 @@
       </w:tabs>
     </w:pPr>
     <w:rPr>
-      <w:rFonts w:ascii="Courier" w:hAnsi="Courier"/>
+      <w:rFonts w:ascii="Times New Roman" w:hAnsi="Times New Roman" w:eastAsia="Times New Roman" w:cs="Times New Roman"/>
       <w:sz w:val="20"/>
       <w:szCs w:val="20"/>
     </w:rPr>
@@ -8354,7 +8165,7 @@
     <w:uiPriority w:val="99"/>
     <w:rsid w:val="0029639D"/>
     <w:rPr>
-      <w:rFonts w:ascii="Courier" w:hAnsi="Courier"/>
+      <w:rFonts w:ascii="Times New Roman" w:hAnsi="Times New Roman" w:eastAsia="Times New Roman" w:cs="Times New Roman"/>
       <w:sz w:val="20"/>
       <w:szCs w:val="20"/>
     </w:rPr>
@@ -8368,6 +8179,7 @@
     <w:qFormat/>
     <w:rsid w:val="00FC693F"/>
     <w:rPr>
+      <w:rFonts w:ascii="Times New Roman" w:hAnsi="Times New Roman"/>
       <w:i/>
       <w:iCs/>
       <w:color w:val="000000" w:themeColor="text1"/>
@@ -8380,6 +8192,7 @@
     <w:uiPriority w:val="29"/>
     <w:rsid w:val="00FC693F"/>
     <w:rPr>
+      <w:rFonts w:ascii="Times New Roman" w:hAnsi="Times New Roman"/>
       <w:i/>
       <w:iCs/>
       <w:color w:val="000000" w:themeColor="text1"/>
@@ -8393,7 +8206,7 @@
     <w:semiHidden/>
     <w:rsid w:val="00FC693F"/>
     <w:rPr>
-      <w:rFonts w:asciiTheme="majorHAnsi" w:eastAsiaTheme="majorEastAsia" w:hAnsiTheme="majorHAnsi" w:cstheme="majorBidi"/>
+      <w:rFonts w:ascii="Times New Roman" w:hAnsi="Times New Roman" w:eastAsia="Times New Roman" w:cs="Times New Roman"/>
       <w:b/>
       <w:bCs/>
       <w:i/>
@@ -8409,7 +8222,7 @@
     <w:semiHidden/>
     <w:rsid w:val="00FC693F"/>
     <w:rPr>
-      <w:rFonts w:asciiTheme="majorHAnsi" w:eastAsiaTheme="majorEastAsia" w:hAnsiTheme="majorHAnsi" w:cstheme="majorBidi"/>
+      <w:rFonts w:ascii="Times New Roman" w:hAnsi="Times New Roman" w:eastAsia="Times New Roman" w:cs="Times New Roman"/>
       <w:color w:val="243F60" w:themeColor="accent1" w:themeShade="7F"/>
     </w:rPr>
   </w:style>
@@ -8421,7 +8234,7 @@
     <w:semiHidden/>
     <w:rsid w:val="00FC693F"/>
     <w:rPr>
-      <w:rFonts w:asciiTheme="majorHAnsi" w:eastAsiaTheme="majorEastAsia" w:hAnsiTheme="majorHAnsi" w:cstheme="majorBidi"/>
+      <w:rFonts w:ascii="Times New Roman" w:hAnsi="Times New Roman" w:eastAsia="Times New Roman" w:cs="Times New Roman"/>
       <w:i/>
       <w:iCs/>
       <w:color w:val="243F60" w:themeColor="accent1" w:themeShade="7F"/>
@@ -8435,7 +8248,7 @@
     <w:semiHidden/>
     <w:rsid w:val="00FC693F"/>
     <w:rPr>
-      <w:rFonts w:asciiTheme="majorHAnsi" w:eastAsiaTheme="majorEastAsia" w:hAnsiTheme="majorHAnsi" w:cstheme="majorBidi"/>
+      <w:rFonts w:ascii="Times New Roman" w:hAnsi="Times New Roman" w:eastAsia="Times New Roman" w:cs="Times New Roman"/>
       <w:i/>
       <w:iCs/>
       <w:color w:val="404040" w:themeColor="text1" w:themeTint="BF"/>
@@ -8449,7 +8262,7 @@
     <w:semiHidden/>
     <w:rsid w:val="00FC693F"/>
     <w:rPr>
-      <w:rFonts w:asciiTheme="majorHAnsi" w:eastAsiaTheme="majorEastAsia" w:hAnsiTheme="majorHAnsi" w:cstheme="majorBidi"/>
+      <w:rFonts w:ascii="Times New Roman" w:hAnsi="Times New Roman" w:eastAsia="Times New Roman" w:cs="Times New Roman"/>
       <w:color w:val="4F81BD" w:themeColor="accent1"/>
       <w:sz w:val="20"/>
       <w:szCs w:val="20"/>
@@ -8463,7 +8276,7 @@
     <w:semiHidden/>
     <w:rsid w:val="00FC693F"/>
     <w:rPr>
-      <w:rFonts w:asciiTheme="majorHAnsi" w:eastAsiaTheme="majorEastAsia" w:hAnsiTheme="majorHAnsi" w:cstheme="majorBidi"/>
+      <w:rFonts w:ascii="Times New Roman" w:hAnsi="Times New Roman" w:eastAsia="Times New Roman" w:cs="Times New Roman"/>
       <w:i/>
       <w:iCs/>
       <w:color w:val="404040" w:themeColor="text1" w:themeTint="BF"/>
@@ -8484,6 +8297,7 @@
       <w:spacing w:line="240" w:lineRule="auto"/>
     </w:pPr>
     <w:rPr>
+      <w:rFonts w:ascii="Times New Roman" w:hAnsi="Times New Roman"/>
       <w:b/>
       <w:bCs/>
       <w:color w:val="4F81BD" w:themeColor="accent1"/>
@@ -8498,6 +8312,7 @@
     <w:qFormat/>
     <w:rsid w:val="00FC693F"/>
     <w:rPr>
+      <w:rFonts w:ascii="Times New Roman" w:hAnsi="Times New Roman"/>
       <w:b/>
       <w:bCs/>
     </w:rPr>
@@ -8509,6 +8324,7 @@
     <w:qFormat/>
     <w:rsid w:val="00FC693F"/>
     <w:rPr>
+      <w:rFonts w:ascii="Times New Roman" w:hAnsi="Times New Roman"/>
       <w:i/>
       <w:iCs/>
     </w:rPr>
@@ -8529,6 +8345,7 @@
       <w:ind w:left="936" w:right="936"/>
     </w:pPr>
     <w:rPr>
+      <w:rFonts w:ascii="Times New Roman" w:hAnsi="Times New Roman"/>
       <w:b/>
       <w:bCs/>
       <w:i/>
@@ -8543,6 +8360,7 @@
     <w:uiPriority w:val="30"/>
     <w:rsid w:val="00FC693F"/>
     <w:rPr>
+      <w:rFonts w:ascii="Times New Roman" w:hAnsi="Times New Roman"/>
       <w:b/>
       <w:bCs/>
       <w:i/>
@@ -8557,6 +8375,7 @@
     <w:qFormat/>
     <w:rsid w:val="00FC693F"/>
     <w:rPr>
+      <w:rFonts w:ascii="Times New Roman" w:hAnsi="Times New Roman"/>
       <w:i/>
       <w:iCs/>
       <w:color w:val="808080" w:themeColor="text1" w:themeTint="7F"/>
@@ -8569,6 +8388,7 @@
     <w:qFormat/>
     <w:rsid w:val="00FC693F"/>
     <w:rPr>
+      <w:rFonts w:ascii="Times New Roman" w:hAnsi="Times New Roman"/>
       <w:b/>
       <w:bCs/>
       <w:i/>
@@ -8583,6 +8403,7 @@
     <w:qFormat/>
     <w:rsid w:val="00FC693F"/>
     <w:rPr>
+      <w:rFonts w:ascii="Times New Roman" w:hAnsi="Times New Roman"/>
       <w:smallCaps/>
       <w:color w:val="C0504D" w:themeColor="accent2"/>
       <w:u w:val="single"/>
@@ -8595,6 +8416,7 @@
     <w:qFormat/>
     <w:rsid w:val="00FC693F"/>
     <w:rPr>
+      <w:rFonts w:ascii="Times New Roman" w:hAnsi="Times New Roman"/>
       <w:b/>
       <w:bCs/>
       <w:smallCaps/>
@@ -8610,6 +8432,7 @@
     <w:qFormat/>
     <w:rsid w:val="00FC693F"/>
     <w:rPr>
+      <w:rFonts w:ascii="Times New Roman" w:hAnsi="Times New Roman"/>
       <w:b/>
       <w:bCs/>
       <w:smallCaps/>
@@ -8628,6 +8451,9 @@
     <w:pPr>
       <w:outlineLvl w:val="9"/>
     </w:pPr>
+    <w:rPr>
+      <w:rFonts w:ascii="Times New Roman" w:hAnsi="Times New Roman"/>
+    </w:rPr>
   </w:style>
   <w:style w:type="table" w:styleId="TableGrid">
     <w:name w:val="Table Grid"/>
@@ -10052,7 +9878,7 @@
         <w:spacing w:before="0" w:after="0" w:line="240" w:lineRule="auto"/>
       </w:pPr>
       <w:rPr>
-        <w:rFonts w:asciiTheme="majorHAnsi" w:eastAsiaTheme="majorEastAsia" w:hAnsiTheme="majorHAnsi" w:cstheme="majorBidi"/>
+        <w:rFonts w:ascii="Times New Roman" w:hAnsi="Times New Roman" w:eastAsia="Times New Roman" w:cs="Times New Roman"/>
         <w:b/>
         <w:bCs/>
       </w:rPr>
@@ -10073,7 +9899,7 @@
         <w:spacing w:before="0" w:after="0" w:line="240" w:lineRule="auto"/>
       </w:pPr>
       <w:rPr>
-        <w:rFonts w:asciiTheme="majorHAnsi" w:eastAsiaTheme="majorEastAsia" w:hAnsiTheme="majorHAnsi" w:cstheme="majorBidi"/>
+        <w:rFonts w:ascii="Times New Roman" w:hAnsi="Times New Roman" w:eastAsia="Times New Roman" w:cs="Times New Roman"/>
         <w:b/>
         <w:bCs/>
       </w:rPr>
@@ -10091,14 +9917,14 @@
     </w:tblStylePr>
     <w:tblStylePr w:type="firstCol">
       <w:rPr>
-        <w:rFonts w:asciiTheme="majorHAnsi" w:eastAsiaTheme="majorEastAsia" w:hAnsiTheme="majorHAnsi" w:cstheme="majorBidi"/>
+        <w:rFonts w:ascii="Times New Roman" w:hAnsi="Times New Roman" w:eastAsia="Times New Roman" w:cs="Times New Roman"/>
         <w:b/>
         <w:bCs/>
       </w:rPr>
     </w:tblStylePr>
     <w:tblStylePr w:type="lastCol">
       <w:rPr>
-        <w:rFonts w:asciiTheme="majorHAnsi" w:eastAsiaTheme="majorEastAsia" w:hAnsiTheme="majorHAnsi" w:cstheme="majorBidi"/>
+        <w:rFonts w:ascii="Times New Roman" w:hAnsi="Times New Roman" w:eastAsia="Times New Roman" w:cs="Times New Roman"/>
         <w:b/>
         <w:bCs/>
       </w:rPr>
@@ -10182,7 +10008,7 @@
         <w:spacing w:before="0" w:after="0" w:line="240" w:lineRule="auto"/>
       </w:pPr>
       <w:rPr>
-        <w:rFonts w:asciiTheme="majorHAnsi" w:eastAsiaTheme="majorEastAsia" w:hAnsiTheme="majorHAnsi" w:cstheme="majorBidi"/>
+        <w:rFonts w:ascii="Times New Roman" w:hAnsi="Times New Roman" w:eastAsia="Times New Roman" w:cs="Times New Roman"/>
         <w:b/>
         <w:bCs/>
       </w:rPr>
@@ -10203,7 +10029,7 @@
         <w:spacing w:before="0" w:after="0" w:line="240" w:lineRule="auto"/>
       </w:pPr>
       <w:rPr>
-        <w:rFonts w:asciiTheme="majorHAnsi" w:eastAsiaTheme="majorEastAsia" w:hAnsiTheme="majorHAnsi" w:cstheme="majorBidi"/>
+        <w:rFonts w:ascii="Times New Roman" w:hAnsi="Times New Roman" w:eastAsia="Times New Roman" w:cs="Times New Roman"/>
         <w:b/>
         <w:bCs/>
       </w:rPr>
@@ -10221,14 +10047,14 @@
     </w:tblStylePr>
     <w:tblStylePr w:type="firstCol">
       <w:rPr>
-        <w:rFonts w:asciiTheme="majorHAnsi" w:eastAsiaTheme="majorEastAsia" w:hAnsiTheme="majorHAnsi" w:cstheme="majorBidi"/>
+        <w:rFonts w:ascii="Times New Roman" w:hAnsi="Times New Roman" w:eastAsia="Times New Roman" w:cs="Times New Roman"/>
         <w:b/>
         <w:bCs/>
       </w:rPr>
     </w:tblStylePr>
     <w:tblStylePr w:type="lastCol">
       <w:rPr>
-        <w:rFonts w:asciiTheme="majorHAnsi" w:eastAsiaTheme="majorEastAsia" w:hAnsiTheme="majorHAnsi" w:cstheme="majorBidi"/>
+        <w:rFonts w:ascii="Times New Roman" w:hAnsi="Times New Roman" w:eastAsia="Times New Roman" w:cs="Times New Roman"/>
         <w:b/>
         <w:bCs/>
       </w:rPr>
@@ -10312,7 +10138,7 @@
         <w:spacing w:before="0" w:after="0" w:line="240" w:lineRule="auto"/>
       </w:pPr>
       <w:rPr>
-        <w:rFonts w:asciiTheme="majorHAnsi" w:eastAsiaTheme="majorEastAsia" w:hAnsiTheme="majorHAnsi" w:cstheme="majorBidi"/>
+        <w:rFonts w:ascii="Times New Roman" w:hAnsi="Times New Roman" w:eastAsia="Times New Roman" w:cs="Times New Roman"/>
         <w:b/>
         <w:bCs/>
       </w:rPr>
@@ -10333,7 +10159,7 @@
         <w:spacing w:before="0" w:after="0" w:line="240" w:lineRule="auto"/>
       </w:pPr>
       <w:rPr>
-        <w:rFonts w:asciiTheme="majorHAnsi" w:eastAsiaTheme="majorEastAsia" w:hAnsiTheme="majorHAnsi" w:cstheme="majorBidi"/>
+        <w:rFonts w:ascii="Times New Roman" w:hAnsi="Times New Roman" w:eastAsia="Times New Roman" w:cs="Times New Roman"/>
         <w:b/>
         <w:bCs/>
       </w:rPr>
@@ -10351,14 +10177,14 @@
     </w:tblStylePr>
     <w:tblStylePr w:type="firstCol">
       <w:rPr>
-        <w:rFonts w:asciiTheme="majorHAnsi" w:eastAsiaTheme="majorEastAsia" w:hAnsiTheme="majorHAnsi" w:cstheme="majorBidi"/>
+        <w:rFonts w:ascii="Times New Roman" w:hAnsi="Times New Roman" w:eastAsia="Times New Roman" w:cs="Times New Roman"/>
         <w:b/>
         <w:bCs/>
       </w:rPr>
     </w:tblStylePr>
     <w:tblStylePr w:type="lastCol">
       <w:rPr>
-        <w:rFonts w:asciiTheme="majorHAnsi" w:eastAsiaTheme="majorEastAsia" w:hAnsiTheme="majorHAnsi" w:cstheme="majorBidi"/>
+        <w:rFonts w:ascii="Times New Roman" w:hAnsi="Times New Roman" w:eastAsia="Times New Roman" w:cs="Times New Roman"/>
         <w:b/>
         <w:bCs/>
       </w:rPr>
@@ -10442,7 +10268,7 @@
         <w:spacing w:before="0" w:after="0" w:line="240" w:lineRule="auto"/>
       </w:pPr>
       <w:rPr>
-        <w:rFonts w:asciiTheme="majorHAnsi" w:eastAsiaTheme="majorEastAsia" w:hAnsiTheme="majorHAnsi" w:cstheme="majorBidi"/>
+        <w:rFonts w:ascii="Times New Roman" w:hAnsi="Times New Roman" w:eastAsia="Times New Roman" w:cs="Times New Roman"/>
         <w:b/>
         <w:bCs/>
       </w:rPr>
@@ -10463,7 +10289,7 @@
         <w:spacing w:before="0" w:after="0" w:line="240" w:lineRule="auto"/>
       </w:pPr>
       <w:rPr>
-        <w:rFonts w:asciiTheme="majorHAnsi" w:eastAsiaTheme="majorEastAsia" w:hAnsiTheme="majorHAnsi" w:cstheme="majorBidi"/>
+        <w:rFonts w:ascii="Times New Roman" w:hAnsi="Times New Roman" w:eastAsia="Times New Roman" w:cs="Times New Roman"/>
         <w:b/>
         <w:bCs/>
       </w:rPr>
@@ -10481,14 +10307,14 @@
     </w:tblStylePr>
     <w:tblStylePr w:type="firstCol">
       <w:rPr>
-        <w:rFonts w:asciiTheme="majorHAnsi" w:eastAsiaTheme="majorEastAsia" w:hAnsiTheme="majorHAnsi" w:cstheme="majorBidi"/>
+        <w:rFonts w:ascii="Times New Roman" w:hAnsi="Times New Roman" w:eastAsia="Times New Roman" w:cs="Times New Roman"/>
         <w:b/>
         <w:bCs/>
       </w:rPr>
     </w:tblStylePr>
     <w:tblStylePr w:type="lastCol">
       <w:rPr>
-        <w:rFonts w:asciiTheme="majorHAnsi" w:eastAsiaTheme="majorEastAsia" w:hAnsiTheme="majorHAnsi" w:cstheme="majorBidi"/>
+        <w:rFonts w:ascii="Times New Roman" w:hAnsi="Times New Roman" w:eastAsia="Times New Roman" w:cs="Times New Roman"/>
         <w:b/>
         <w:bCs/>
       </w:rPr>
@@ -10572,7 +10398,7 @@
         <w:spacing w:before="0" w:after="0" w:line="240" w:lineRule="auto"/>
       </w:pPr>
       <w:rPr>
-        <w:rFonts w:asciiTheme="majorHAnsi" w:eastAsiaTheme="majorEastAsia" w:hAnsiTheme="majorHAnsi" w:cstheme="majorBidi"/>
+        <w:rFonts w:ascii="Times New Roman" w:hAnsi="Times New Roman" w:eastAsia="Times New Roman" w:cs="Times New Roman"/>
         <w:b/>
         <w:bCs/>
       </w:rPr>
@@ -10593,7 +10419,7 @@
         <w:spacing w:before="0" w:after="0" w:line="240" w:lineRule="auto"/>
       </w:pPr>
       <w:rPr>
-        <w:rFonts w:asciiTheme="majorHAnsi" w:eastAsiaTheme="majorEastAsia" w:hAnsiTheme="majorHAnsi" w:cstheme="majorBidi"/>
+        <w:rFonts w:ascii="Times New Roman" w:hAnsi="Times New Roman" w:eastAsia="Times New Roman" w:cs="Times New Roman"/>
         <w:b/>
         <w:bCs/>
       </w:rPr>
@@ -10611,14 +10437,14 @@
     </w:tblStylePr>
     <w:tblStylePr w:type="firstCol">
       <w:rPr>
-        <w:rFonts w:asciiTheme="majorHAnsi" w:eastAsiaTheme="majorEastAsia" w:hAnsiTheme="majorHAnsi" w:cstheme="majorBidi"/>
+        <w:rFonts w:ascii="Times New Roman" w:hAnsi="Times New Roman" w:eastAsia="Times New Roman" w:cs="Times New Roman"/>
         <w:b/>
         <w:bCs/>
       </w:rPr>
     </w:tblStylePr>
     <w:tblStylePr w:type="lastCol">
       <w:rPr>
-        <w:rFonts w:asciiTheme="majorHAnsi" w:eastAsiaTheme="majorEastAsia" w:hAnsiTheme="majorHAnsi" w:cstheme="majorBidi"/>
+        <w:rFonts w:ascii="Times New Roman" w:hAnsi="Times New Roman" w:eastAsia="Times New Roman" w:cs="Times New Roman"/>
         <w:b/>
         <w:bCs/>
       </w:rPr>
@@ -10702,7 +10528,7 @@
         <w:spacing w:before="0" w:after="0" w:line="240" w:lineRule="auto"/>
       </w:pPr>
       <w:rPr>
-        <w:rFonts w:asciiTheme="majorHAnsi" w:eastAsiaTheme="majorEastAsia" w:hAnsiTheme="majorHAnsi" w:cstheme="majorBidi"/>
+        <w:rFonts w:ascii="Times New Roman" w:hAnsi="Times New Roman" w:eastAsia="Times New Roman" w:cs="Times New Roman"/>
         <w:b/>
         <w:bCs/>
       </w:rPr>
@@ -10723,7 +10549,7 @@
         <w:spacing w:before="0" w:after="0" w:line="240" w:lineRule="auto"/>
       </w:pPr>
       <w:rPr>
-        <w:rFonts w:asciiTheme="majorHAnsi" w:eastAsiaTheme="majorEastAsia" w:hAnsiTheme="majorHAnsi" w:cstheme="majorBidi"/>
+        <w:rFonts w:ascii="Times New Roman" w:hAnsi="Times New Roman" w:eastAsia="Times New Roman" w:cs="Times New Roman"/>
         <w:b/>
         <w:bCs/>
       </w:rPr>
@@ -10741,14 +10567,14 @@
     </w:tblStylePr>
     <w:tblStylePr w:type="firstCol">
       <w:rPr>
-        <w:rFonts w:asciiTheme="majorHAnsi" w:eastAsiaTheme="majorEastAsia" w:hAnsiTheme="majorHAnsi" w:cstheme="majorBidi"/>
+        <w:rFonts w:ascii="Times New Roman" w:hAnsi="Times New Roman" w:eastAsia="Times New Roman" w:cs="Times New Roman"/>
         <w:b/>
         <w:bCs/>
       </w:rPr>
     </w:tblStylePr>
     <w:tblStylePr w:type="lastCol">
       <w:rPr>
-        <w:rFonts w:asciiTheme="majorHAnsi" w:eastAsiaTheme="majorEastAsia" w:hAnsiTheme="majorHAnsi" w:cstheme="majorBidi"/>
+        <w:rFonts w:ascii="Times New Roman" w:hAnsi="Times New Roman" w:eastAsia="Times New Roman" w:cs="Times New Roman"/>
         <w:b/>
         <w:bCs/>
       </w:rPr>
@@ -10832,7 +10658,7 @@
         <w:spacing w:before="0" w:after="0" w:line="240" w:lineRule="auto"/>
       </w:pPr>
       <w:rPr>
-        <w:rFonts w:asciiTheme="majorHAnsi" w:eastAsiaTheme="majorEastAsia" w:hAnsiTheme="majorHAnsi" w:cstheme="majorBidi"/>
+        <w:rFonts w:ascii="Times New Roman" w:hAnsi="Times New Roman" w:eastAsia="Times New Roman" w:cs="Times New Roman"/>
         <w:b/>
         <w:bCs/>
       </w:rPr>
@@ -10853,7 +10679,7 @@
         <w:spacing w:before="0" w:after="0" w:line="240" w:lineRule="auto"/>
       </w:pPr>
       <w:rPr>
-        <w:rFonts w:asciiTheme="majorHAnsi" w:eastAsiaTheme="majorEastAsia" w:hAnsiTheme="majorHAnsi" w:cstheme="majorBidi"/>
+        <w:rFonts w:ascii="Times New Roman" w:hAnsi="Times New Roman" w:eastAsia="Times New Roman" w:cs="Times New Roman"/>
         <w:b/>
         <w:bCs/>
       </w:rPr>
@@ -10871,14 +10697,14 @@
     </w:tblStylePr>
     <w:tblStylePr w:type="firstCol">
       <w:rPr>
-        <w:rFonts w:asciiTheme="majorHAnsi" w:eastAsiaTheme="majorEastAsia" w:hAnsiTheme="majorHAnsi" w:cstheme="majorBidi"/>
+        <w:rFonts w:ascii="Times New Roman" w:hAnsi="Times New Roman" w:eastAsia="Times New Roman" w:cs="Times New Roman"/>
         <w:b/>
         <w:bCs/>
       </w:rPr>
     </w:tblStylePr>
     <w:tblStylePr w:type="lastCol">
       <w:rPr>
-        <w:rFonts w:asciiTheme="majorHAnsi" w:eastAsiaTheme="majorEastAsia" w:hAnsiTheme="majorHAnsi" w:cstheme="majorBidi"/>
+        <w:rFonts w:ascii="Times New Roman" w:hAnsi="Times New Roman" w:eastAsia="Times New Roman" w:cs="Times New Roman"/>
         <w:b/>
         <w:bCs/>
       </w:rPr>
@@ -12743,7 +12569,7 @@
     </w:tblPr>
     <w:tblStylePr w:type="firstRow">
       <w:rPr>
-        <w:rFonts w:asciiTheme="majorHAnsi" w:eastAsiaTheme="majorEastAsia" w:hAnsiTheme="majorHAnsi" w:cstheme="majorBidi"/>
+        <w:rFonts w:ascii="Times New Roman" w:hAnsi="Times New Roman" w:eastAsia="Times New Roman" w:cs="Times New Roman"/>
       </w:rPr>
       <w:tblPr/>
       <w:tcPr>
@@ -12827,7 +12653,7 @@
     </w:tblPr>
     <w:tblStylePr w:type="firstRow">
       <w:rPr>
-        <w:rFonts w:asciiTheme="majorHAnsi" w:eastAsiaTheme="majorEastAsia" w:hAnsiTheme="majorHAnsi" w:cstheme="majorBidi"/>
+        <w:rFonts w:ascii="Times New Roman" w:hAnsi="Times New Roman" w:eastAsia="Times New Roman" w:cs="Times New Roman"/>
       </w:rPr>
       <w:tblPr/>
       <w:tcPr>
@@ -12911,7 +12737,7 @@
     </w:tblPr>
     <w:tblStylePr w:type="firstRow">
       <w:rPr>
-        <w:rFonts w:asciiTheme="majorHAnsi" w:eastAsiaTheme="majorEastAsia" w:hAnsiTheme="majorHAnsi" w:cstheme="majorBidi"/>
+        <w:rFonts w:ascii="Times New Roman" w:hAnsi="Times New Roman" w:eastAsia="Times New Roman" w:cs="Times New Roman"/>
       </w:rPr>
       <w:tblPr/>
       <w:tcPr>
@@ -12995,7 +12821,7 @@
     </w:tblPr>
     <w:tblStylePr w:type="firstRow">
       <w:rPr>
-        <w:rFonts w:asciiTheme="majorHAnsi" w:eastAsiaTheme="majorEastAsia" w:hAnsiTheme="majorHAnsi" w:cstheme="majorBidi"/>
+        <w:rFonts w:ascii="Times New Roman" w:hAnsi="Times New Roman" w:eastAsia="Times New Roman" w:cs="Times New Roman"/>
       </w:rPr>
       <w:tblPr/>
       <w:tcPr>
@@ -13079,7 +12905,7 @@
     </w:tblPr>
     <w:tblStylePr w:type="firstRow">
       <w:rPr>
-        <w:rFonts w:asciiTheme="majorHAnsi" w:eastAsiaTheme="majorEastAsia" w:hAnsiTheme="majorHAnsi" w:cstheme="majorBidi"/>
+        <w:rFonts w:ascii="Times New Roman" w:hAnsi="Times New Roman" w:eastAsia="Times New Roman" w:cs="Times New Roman"/>
       </w:rPr>
       <w:tblPr/>
       <w:tcPr>
@@ -13163,7 +12989,7 @@
     </w:tblPr>
     <w:tblStylePr w:type="firstRow">
       <w:rPr>
-        <w:rFonts w:asciiTheme="majorHAnsi" w:eastAsiaTheme="majorEastAsia" w:hAnsiTheme="majorHAnsi" w:cstheme="majorBidi"/>
+        <w:rFonts w:ascii="Times New Roman" w:hAnsi="Times New Roman" w:eastAsia="Times New Roman" w:cs="Times New Roman"/>
       </w:rPr>
       <w:tblPr/>
       <w:tcPr>
@@ -13247,7 +13073,7 @@
     </w:tblPr>
     <w:tblStylePr w:type="firstRow">
       <w:rPr>
-        <w:rFonts w:asciiTheme="majorHAnsi" w:eastAsiaTheme="majorEastAsia" w:hAnsiTheme="majorHAnsi" w:cstheme="majorBidi"/>
+        <w:rFonts w:ascii="Times New Roman" w:hAnsi="Times New Roman" w:eastAsia="Times New Roman" w:cs="Times New Roman"/>
       </w:rPr>
       <w:tblPr/>
       <w:tcPr>
@@ -13312,7 +13138,7 @@
       <w:spacing w:after="0" w:line="240" w:lineRule="auto"/>
     </w:pPr>
     <w:rPr>
-      <w:rFonts w:asciiTheme="majorHAnsi" w:eastAsiaTheme="majorEastAsia" w:hAnsiTheme="majorHAnsi" w:cstheme="majorBidi"/>
+      <w:rFonts w:ascii="Times New Roman" w:hAnsi="Times New Roman" w:eastAsia="Times New Roman" w:cs="Times New Roman"/>
       <w:color w:val="000000" w:themeColor="text1"/>
     </w:rPr>
     <w:tblPr>
@@ -13440,7 +13266,7 @@
       <w:spacing w:after="0" w:line="240" w:lineRule="auto"/>
     </w:pPr>
     <w:rPr>
-      <w:rFonts w:asciiTheme="majorHAnsi" w:eastAsiaTheme="majorEastAsia" w:hAnsiTheme="majorHAnsi" w:cstheme="majorBidi"/>
+      <w:rFonts w:ascii="Times New Roman" w:hAnsi="Times New Roman" w:eastAsia="Times New Roman" w:cs="Times New Roman"/>
       <w:color w:val="000000" w:themeColor="text1"/>
     </w:rPr>
     <w:tblPr>
@@ -13568,7 +13394,7 @@
       <w:spacing w:after="0" w:line="240" w:lineRule="auto"/>
     </w:pPr>
     <w:rPr>
-      <w:rFonts w:asciiTheme="majorHAnsi" w:eastAsiaTheme="majorEastAsia" w:hAnsiTheme="majorHAnsi" w:cstheme="majorBidi"/>
+      <w:rFonts w:ascii="Times New Roman" w:hAnsi="Times New Roman" w:eastAsia="Times New Roman" w:cs="Times New Roman"/>
       <w:color w:val="000000" w:themeColor="text1"/>
     </w:rPr>
     <w:tblPr>
@@ -13696,7 +13522,7 @@
       <w:spacing w:after="0" w:line="240" w:lineRule="auto"/>
     </w:pPr>
     <w:rPr>
-      <w:rFonts w:asciiTheme="majorHAnsi" w:eastAsiaTheme="majorEastAsia" w:hAnsiTheme="majorHAnsi" w:cstheme="majorBidi"/>
+      <w:rFonts w:ascii="Times New Roman" w:hAnsi="Times New Roman" w:eastAsia="Times New Roman" w:cs="Times New Roman"/>
       <w:color w:val="000000" w:themeColor="text1"/>
     </w:rPr>
     <w:tblPr>
@@ -13824,7 +13650,7 @@
       <w:spacing w:after="0" w:line="240" w:lineRule="auto"/>
     </w:pPr>
     <w:rPr>
-      <w:rFonts w:asciiTheme="majorHAnsi" w:eastAsiaTheme="majorEastAsia" w:hAnsiTheme="majorHAnsi" w:cstheme="majorBidi"/>
+      <w:rFonts w:ascii="Times New Roman" w:hAnsi="Times New Roman" w:eastAsia="Times New Roman" w:cs="Times New Roman"/>
       <w:color w:val="000000" w:themeColor="text1"/>
     </w:rPr>
     <w:tblPr>
@@ -13952,7 +13778,7 @@
       <w:spacing w:after="0" w:line="240" w:lineRule="auto"/>
     </w:pPr>
     <w:rPr>
-      <w:rFonts w:asciiTheme="majorHAnsi" w:eastAsiaTheme="majorEastAsia" w:hAnsiTheme="majorHAnsi" w:cstheme="majorBidi"/>
+      <w:rFonts w:ascii="Times New Roman" w:hAnsi="Times New Roman" w:eastAsia="Times New Roman" w:cs="Times New Roman"/>
       <w:color w:val="000000" w:themeColor="text1"/>
     </w:rPr>
     <w:tblPr>
@@ -14080,7 +13906,7 @@
       <w:spacing w:after="0" w:line="240" w:lineRule="auto"/>
     </w:pPr>
     <w:rPr>
-      <w:rFonts w:asciiTheme="majorHAnsi" w:eastAsiaTheme="majorEastAsia" w:hAnsiTheme="majorHAnsi" w:cstheme="majorBidi"/>
+      <w:rFonts w:ascii="Times New Roman" w:hAnsi="Times New Roman" w:eastAsia="Times New Roman" w:cs="Times New Roman"/>
       <w:color w:val="000000" w:themeColor="text1"/>
     </w:rPr>
     <w:tblPr>
@@ -14719,7 +14545,7 @@
       <w:spacing w:after="0" w:line="240" w:lineRule="auto"/>
     </w:pPr>
     <w:rPr>
-      <w:rFonts w:asciiTheme="majorHAnsi" w:eastAsiaTheme="majorEastAsia" w:hAnsiTheme="majorHAnsi" w:cstheme="majorBidi"/>
+      <w:rFonts w:ascii="Times New Roman" w:hAnsi="Times New Roman" w:eastAsia="Times New Roman" w:cs="Times New Roman"/>
       <w:color w:val="000000" w:themeColor="text1"/>
     </w:rPr>
     <w:tblPr>
@@ -14844,7 +14670,7 @@
       <w:spacing w:after="0" w:line="240" w:lineRule="auto"/>
     </w:pPr>
     <w:rPr>
-      <w:rFonts w:asciiTheme="majorHAnsi" w:eastAsiaTheme="majorEastAsia" w:hAnsiTheme="majorHAnsi" w:cstheme="majorBidi"/>
+      <w:rFonts w:ascii="Times New Roman" w:hAnsi="Times New Roman" w:eastAsia="Times New Roman" w:cs="Times New Roman"/>
       <w:color w:val="000000" w:themeColor="text1"/>
     </w:rPr>
     <w:tblPr>
@@ -14969,7 +14795,7 @@
       <w:spacing w:after="0" w:line="240" w:lineRule="auto"/>
     </w:pPr>
     <w:rPr>
-      <w:rFonts w:asciiTheme="majorHAnsi" w:eastAsiaTheme="majorEastAsia" w:hAnsiTheme="majorHAnsi" w:cstheme="majorBidi"/>
+      <w:rFonts w:ascii="Times New Roman" w:hAnsi="Times New Roman" w:eastAsia="Times New Roman" w:cs="Times New Roman"/>
       <w:color w:val="000000" w:themeColor="text1"/>
     </w:rPr>
     <w:tblPr>
@@ -15094,7 +14920,7 @@
       <w:spacing w:after="0" w:line="240" w:lineRule="auto"/>
     </w:pPr>
     <w:rPr>
-      <w:rFonts w:asciiTheme="majorHAnsi" w:eastAsiaTheme="majorEastAsia" w:hAnsiTheme="majorHAnsi" w:cstheme="majorBidi"/>
+      <w:rFonts w:ascii="Times New Roman" w:hAnsi="Times New Roman" w:eastAsia="Times New Roman" w:cs="Times New Roman"/>
       <w:color w:val="000000" w:themeColor="text1"/>
     </w:rPr>
     <w:tblPr>
@@ -15219,7 +15045,7 @@
       <w:spacing w:after="0" w:line="240" w:lineRule="auto"/>
     </w:pPr>
     <w:rPr>
-      <w:rFonts w:asciiTheme="majorHAnsi" w:eastAsiaTheme="majorEastAsia" w:hAnsiTheme="majorHAnsi" w:cstheme="majorBidi"/>
+      <w:rFonts w:ascii="Times New Roman" w:hAnsi="Times New Roman" w:eastAsia="Times New Roman" w:cs="Times New Roman"/>
       <w:color w:val="000000" w:themeColor="text1"/>
     </w:rPr>
     <w:tblPr>
@@ -15344,7 +15170,7 @@
       <w:spacing w:after="0" w:line="240" w:lineRule="auto"/>
     </w:pPr>
     <w:rPr>
-      <w:rFonts w:asciiTheme="majorHAnsi" w:eastAsiaTheme="majorEastAsia" w:hAnsiTheme="majorHAnsi" w:cstheme="majorBidi"/>
+      <w:rFonts w:ascii="Times New Roman" w:hAnsi="Times New Roman" w:eastAsia="Times New Roman" w:cs="Times New Roman"/>
       <w:color w:val="000000" w:themeColor="text1"/>
     </w:rPr>
     <w:tblPr>
@@ -15469,7 +15295,7 @@
       <w:spacing w:after="0" w:line="240" w:lineRule="auto"/>
     </w:pPr>
     <w:rPr>
-      <w:rFonts w:asciiTheme="majorHAnsi" w:eastAsiaTheme="majorEastAsia" w:hAnsiTheme="majorHAnsi" w:cstheme="majorBidi"/>
+      <w:rFonts w:ascii="Times New Roman" w:hAnsi="Times New Roman" w:eastAsia="Times New Roman" w:cs="Times New Roman"/>
       <w:color w:val="000000" w:themeColor="text1"/>
     </w:rPr>
     <w:tblPr>

</xml_diff>

<commit_message>
Presentation: platform-wide story, new architecture diagram with the upload path
Co-Authored-By: Claude Sonnet 5.5 <noreply@anthropic.com>
</commit_message>
<xml_diff>
--- a/docs/TY_Mini_Project_Report.docx
+++ b/docs/TY_Mini_Project_Report.docx
@@ -2260,7 +2260,7 @@
       <w:r>
         <w:drawing>
           <wp:inline xmlns:a="http://schemas.openxmlformats.org/drawingml/2006/main" xmlns:pic="http://schemas.openxmlformats.org/drawingml/2006/picture">
-            <wp:extent cx="5580000" cy="3705962"/>
+            <wp:extent cx="5580000" cy="4137623"/>
             <wp:docPr id="3" name="Picture 3"/>
             <wp:cNvGraphicFramePr>
               <a:graphicFrameLocks noChangeAspect="1"/>
@@ -2281,7 +2281,7 @@
                   <pic:spPr>
                     <a:xfrm>
                       <a:off x="0" y="0"/>
-                      <a:ext cx="5580000" cy="3705962"/>
+                      <a:ext cx="5580000" cy="4137623"/>
                     </a:xfrm>
                     <a:prstGeom prst="rect"/>
                   </pic:spPr>
@@ -2302,7 +2302,7 @@
           <w:b/>
           <w:sz w:val="20"/>
         </w:rPr>
-        <w:t>Fig 3.1 Architecture of the system: offline batch pipeline and online application</w:t>
+        <w:t>Fig 3.1 Architecture of the system: data sources, ingestion paths, shared stores, API and interface</w:t>
       </w:r>
     </w:p>
     <w:p>

</xml_diff>

<commit_message>
Report: numbered IEEE citations in text and tables, references in order of first citation
Co-Authored-By: Claude Sonnet 5.5 <noreply@anthropic.com>
</commit_message>
<xml_diff>
--- a/docs/TY_Mini_Project_Report.docx
+++ b/docs/TY_Mini_Project_Report.docx
@@ -384,7 +384,7 @@
       <w:r>
         <w:t>2.2 Findings from Literature Survey</w:t>
         <w:tab/>
-        <w:t>6</w:t>
+        <w:t>7</w:t>
       </w:r>
     </w:p>
     <w:p>
@@ -701,7 +701,7 @@
           <w:b w:val="0"/>
           <w:i w:val="0"/>
         </w:rPr>
-        <w:t>The data used is PaySim, a public benchmark of simulated mobile-money transactions generated from the logs of a real service and containing a ground-truth fraud label. In it, fraud follows a clear pattern, account takeover followed by cash-out: the money of a victim is transferred to a mule account and then withdrawn as cash. The system exploits the balance behaviour that this leaves behind, such as the sender's account being emptied and the receiver's recorded balance not changing although money arrived.</w:t>
+        <w:t>The data used is PaySim [1], a public benchmark of simulated mobile-money transactions generated from the logs of a real service and containing a ground-truth fraud label. In it, fraud follows a clear pattern, account takeover followed by cash-out: the money of a victim is transferred to a mule account and then withdrawn as cash. The system exploits the balance behaviour that this leaves behind, such as the sender's account being emptied and the receiver's recorded balance not changing although money arrived.</w:t>
       </w:r>
     </w:p>
     <w:p>
@@ -721,7 +721,7 @@
           <w:b w:val="0"/>
           <w:i w:val="0"/>
         </w:rPr>
-        <w:t>The motivation for this project comes from three observations. First, fraud datasets are a textbook example of class imbalance. With one fraud in 776 transactions, accuracy is a meaningless measure, and an analyst needs a model that is judged by precision (how many alerts are real) and recall (how many frauds are found). Second, the data is large enough that the way it is stored and queried matters: a full scan of 6.36 million rows with a distributed engine takes more than a second, which is too slow for an interactive search, while an index brings the same lookup down to a few milliseconds.</w:t>
+        <w:t>The motivation for this project comes from three observations. First, fraud datasets are a textbook example of class imbalance. With one fraud in 776 transactions, accuracy is a meaningless measure, and an analyst needs a model that is judged by precision (how many alerts are real) and recall (how many frauds are found) [2]. Second, the data is large enough that the way it is stored and queried matters: a full scan of 6.36 million rows with a distributed engine [3] takes more than a second, which is too slow for an interactive search, while an index brings the same lookup down to a few milliseconds.</w:t>
       </w:r>
     </w:p>
     <w:p>
@@ -733,7 +733,7 @@
           <w:b w:val="0"/>
           <w:i w:val="0"/>
         </w:rPr>
-        <w:t>Third, a model on its own does not help an analyst. In practice, flagged transactions must be searched, reviewed, discussed and closed. This needs an application with a case workflow, and with the ability to score new batches of transactions that arrive as files. The project was therefore designed to cover the whole path from raw data to an investigated case, using technologies from the big-data ecosystem: Spark for batch processing and learning, Parquet for storage, a document database for operational data, and an embedded analytical database for fast lookups.</w:t>
+        <w:t>Third, a model on its own does not help an analyst. In practice, flagged transactions must be searched, reviewed, discussed and closed. This needs an application with a case workflow, and with the ability to score new batches of transactions that arrive as files. The project was therefore designed to cover the whole path from raw data to an investigated case, using technologies from the big-data ecosystem: Spark for batch processing [3] and learning [4], Parquet for storage, a document database for operational data, and an embedded analytical database for fast lookups.</w:t>
       </w:r>
     </w:p>
     <w:p>
@@ -963,7 +963,7 @@
           <w:b w:val="0"/>
           <w:i w:val="0"/>
         </w:rPr>
-        <w:t xml:space="preserve"> Banks traditionally flag transactions with fixed rules, for example "flag any transfer above a threshold". In the PaySim data, the provider's rule (isFlaggedFraud) flags only 16 of 8,197 fraudulent transactions, a recall of 0.2%. Rules are easy to explain but are quickly evaded and cannot learn the balance behaviour that characterises fraud.</w:t>
+        <w:t xml:space="preserve"> Banks traditionally flag transactions with fixed rules, for example "flag any transfer above a threshold". In the PaySim data [1], the provider's rule (isFlaggedFraud) flags only 16 of 8,197 fraudulent transactions, a recall of 0.2%. Rules are easy to explain but are quickly evaded and cannot learn the balance behaviour that characterises fraud.</w:t>
       </w:r>
     </w:p>
     <w:p>
@@ -1001,7 +1001,7 @@
           <w:b w:val="0"/>
           <w:i w:val="0"/>
         </w:rPr>
-        <w:t xml:space="preserve"> Many public solutions to fraud datasets use a notebook with pandas and scikit-learn. This is adequate for a few hundred thousand rows, but loads all data into one process's memory, reports accuracy on a rare class, and offers no search, case workflow or upload. The widely used credit-card fraud dataset from the Machine Learning Group of ULB, for instance, has 284,807 transactions of which 492 are fraudulent, which is small enough to hide scalability problems.</w:t>
+        <w:t xml:space="preserve"> Many public solutions to fraud datasets use a notebook with pandas and scikit-learn. This is adequate for a few hundred thousand rows, but loads all data into one process's memory, reports accuracy on a rare class, and offers no search, case workflow or upload. The widely used credit-card fraud dataset from the Machine Learning Group of ULB [5], for instance, has 284,807 transactions of which 492 are fraudulent, which is small enough to hide scalability problems.</w:t>
       </w:r>
     </w:p>
     <w:p>
@@ -1020,7 +1020,7 @@
           <w:b w:val="0"/>
           <w:i w:val="0"/>
         </w:rPr>
-        <w:t xml:space="preserve"> A distributed batch engine such as Spark is excellent for processing and learning, but when it is used to answer an individual lookup it rescans the data. In our measurement, finding the transactions of one account among 6.36 million rows with Spark took a median of 1,441 ms, against 2.5 ms with an index.</w:t>
+        <w:t xml:space="preserve"> A distributed batch engine such as Spark [3] is excellent for processing and learning, but when it is used to answer an individual lookup it rescans the data. In our measurement, finding the transactions of one account among 6.36 million rows with Spark took a median of 1,441 ms, against 2.5 ms with an index. An embeddable analytical database such as DuckDB [6] with an adaptive radix tree index [7] answers the same lookup in milliseconds.</w:t>
       </w:r>
     </w:p>
     <w:p>
@@ -1039,7 +1039,7 @@
           <w:b w:val="0"/>
           <w:i w:val="0"/>
         </w:rPr>
-        <w:t xml:space="preserve"> Oversampling methods such as SMOTE create synthetic minority examples, and undersampling discards majority examples. They are useful but change the data distribution; this project instead uses class weights for the baseline model, deep trees for the forest, and evaluation with precision, recall and the precision-recall curve, which is recommended for imbalanced problems.</w:t>
+        <w:t xml:space="preserve"> Oversampling methods such as SMOTE [8] create synthetic minority examples, and undersampling discards majority examples. They are useful but change the data distribution; this project instead uses class weights for the baseline model, deep trees for the Random Forest [9], and evaluation with precision, recall and the precision-recall curve, which is recommended for imbalanced problems [2].</w:t>
       </w:r>
     </w:p>
     <w:p>
@@ -1058,7 +1058,7 @@
           <w:b w:val="0"/>
           <w:i w:val="0"/>
         </w:rPr>
-        <w:t xml:space="preserve"> Real transactions are confidential. PaySim is a simulator calibrated on aggregated logs of a real mobile-money service, which provides a labelled benchmark of 6.36 million transactions. It has become a common dataset for fraud research, with the limitation that its fraud follows a simplified pattern.</w:t>
+        <w:t xml:space="preserve"> Real transactions are confidential. PaySim [1] is a simulator calibrated on aggregated logs of a real mobile-money service, which provides a labelled benchmark of 6.36 million transactions. It has become a common dataset for fraud research, with the limitation that its fraud follows a simplified pattern.</w:t>
       </w:r>
     </w:p>
     <w:p>
@@ -1109,7 +1109,7 @@
         </w:tc>
         <w:tc>
           <w:tcPr>
-            <w:tcW w:type="dxa" w:w="2211"/>
+            <w:tcW w:type="dxa" w:w="2665"/>
             <w:shd w:val="clear" w:color="auto" w:fill="E7ECF1"/>
           </w:tcPr>
           <w:p>
@@ -1129,7 +1129,7 @@
         </w:tc>
         <w:tc>
           <w:tcPr>
-            <w:tcW w:type="dxa" w:w="1531"/>
+            <w:tcW w:type="dxa" w:w="737"/>
             <w:shd w:val="clear" w:color="auto" w:fill="E7ECF1"/>
           </w:tcPr>
           <w:p>
@@ -1143,7 +1143,7 @@
                 <w:b/>
                 <w:sz w:val="20"/>
               </w:rPr>
-              <w:t>Authors</w:t>
+              <w:t>Ref.</w:t>
             </w:r>
           </w:p>
         </w:tc>
@@ -1169,7 +1169,7 @@
         </w:tc>
         <w:tc>
           <w:tcPr>
-            <w:tcW w:type="dxa" w:w="2948"/>
+            <w:tcW w:type="dxa" w:w="3288"/>
             <w:shd w:val="clear" w:color="auto" w:fill="E7ECF1"/>
           </w:tcPr>
           <w:p>
@@ -1214,7 +1214,7 @@
         </w:tc>
         <w:tc>
           <w:tcPr>
-            <w:tcW w:type="dxa" w:w="2211"/>
+            <w:tcW w:type="dxa" w:w="2665"/>
           </w:tcPr>
           <w:p>
             <w:pPr>
@@ -1228,13 +1228,13 @@
                 <w:i w:val="0"/>
                 <w:sz w:val="20"/>
               </w:rPr>
-              <w:t>Random Forests</w:t>
+              <w:t>PaySim: A Financial Mobile Money Simulator for Fraud Detection</w:t>
             </w:r>
           </w:p>
         </w:tc>
         <w:tc>
           <w:tcPr>
-            <w:tcW w:type="dxa" w:w="1531"/>
+            <w:tcW w:type="dxa" w:w="737"/>
           </w:tcPr>
           <w:p>
             <w:pPr>
@@ -1248,7 +1248,7 @@
                 <w:i w:val="0"/>
                 <w:sz w:val="20"/>
               </w:rPr>
-              <w:t>Breiman, 2001</w:t>
+              <w:t>[1]</w:t>
             </w:r>
           </w:p>
         </w:tc>
@@ -1268,13 +1268,13 @@
                 <w:i w:val="0"/>
                 <w:sz w:val="20"/>
               </w:rPr>
-              <w:t>Ensemble of decision trees, bagging</w:t>
+              <w:t>Agent-based simulation</w:t>
             </w:r>
           </w:p>
         </w:tc>
         <w:tc>
           <w:tcPr>
-            <w:tcW w:type="dxa" w:w="2948"/>
+            <w:tcW w:type="dxa" w:w="3288"/>
           </w:tcPr>
           <w:p>
             <w:pPr>
@@ -1288,7 +1288,7 @@
                 <w:i w:val="0"/>
                 <w:sz w:val="20"/>
               </w:rPr>
-              <w:t>Showed that averaging many randomised trees gives accurate, robust classifiers; forms the core of the proposed fraud model.</w:t>
+              <w:t>Source of the 6.36 million-row labelled dataset; fraud appears only in transfer and cash-out transactions.</w:t>
             </w:r>
           </w:p>
         </w:tc>
@@ -1319,7 +1319,112 @@
         </w:tc>
         <w:tc>
           <w:tcPr>
-            <w:tcW w:type="dxa" w:w="2211"/>
+            <w:tcW w:type="dxa" w:w="2665"/>
+          </w:tcPr>
+          <w:p>
+            <w:pPr>
+              <w:spacing w:after="40" w:line="240" w:lineRule="auto"/>
+              <w:jc w:val="center"/>
+            </w:pPr>
+            <w:r/>
+            <w:r>
+              <w:rPr>
+                <w:b w:val="0"/>
+                <w:i w:val="0"/>
+                <w:sz w:val="20"/>
+              </w:rPr>
+              <w:t>The Precision-Recall Plot Is More Informative than the ROC Plot on Imbalanced Datasets</w:t>
+            </w:r>
+          </w:p>
+        </w:tc>
+        <w:tc>
+          <w:tcPr>
+            <w:tcW w:type="dxa" w:w="737"/>
+          </w:tcPr>
+          <w:p>
+            <w:pPr>
+              <w:spacing w:after="40" w:line="240" w:lineRule="auto"/>
+              <w:jc w:val="center"/>
+            </w:pPr>
+            <w:r/>
+            <w:r>
+              <w:rPr>
+                <w:b w:val="0"/>
+                <w:i w:val="0"/>
+                <w:sz w:val="20"/>
+              </w:rPr>
+              <w:t>[2]</w:t>
+            </w:r>
+          </w:p>
+        </w:tc>
+        <w:tc>
+          <w:tcPr>
+            <w:tcW w:type="dxa" w:w="1757"/>
+          </w:tcPr>
+          <w:p>
+            <w:pPr>
+              <w:spacing w:after="40" w:line="240" w:lineRule="auto"/>
+              <w:jc w:val="center"/>
+            </w:pPr>
+            <w:r/>
+            <w:r>
+              <w:rPr>
+                <w:b w:val="0"/>
+                <w:i w:val="0"/>
+                <w:sz w:val="20"/>
+              </w:rPr>
+              <w:t>Evaluation metrics</w:t>
+            </w:r>
+          </w:p>
+        </w:tc>
+        <w:tc>
+          <w:tcPr>
+            <w:tcW w:type="dxa" w:w="3288"/>
+          </w:tcPr>
+          <w:p>
+            <w:pPr>
+              <w:spacing w:after="40" w:line="240" w:lineRule="auto"/>
+              <w:jc w:val="center"/>
+            </w:pPr>
+            <w:r/>
+            <w:r>
+              <w:rPr>
+                <w:b w:val="0"/>
+                <w:i w:val="0"/>
+                <w:sz w:val="20"/>
+              </w:rPr>
+              <w:t>Justifies reporting precision, recall and area under the precision-recall curve for rare-class problems.</w:t>
+            </w:r>
+          </w:p>
+        </w:tc>
+      </w:tr>
+      <w:tr>
+        <w:trPr>
+          <w:cantSplit/>
+        </w:trPr>
+        <w:tc>
+          <w:tcPr>
+            <w:tcW w:type="dxa" w:w="624"/>
+          </w:tcPr>
+          <w:p>
+            <w:pPr>
+              <w:spacing w:after="40" w:line="240" w:lineRule="auto"/>
+              <w:jc w:val="center"/>
+            </w:pPr>
+            <w:r/>
+            <w:r>
+              <w:rPr>
+                <w:b w:val="0"/>
+                <w:i w:val="0"/>
+                <w:sz w:val="20"/>
+              </w:rPr>
+              <w:t>3</w:t>
+            </w:r>
+          </w:p>
+        </w:tc>
+        <w:tc>
+          <w:tcPr>
+            <w:tcW w:type="dxa" w:w="2665"/>
           </w:tcPr>
           <w:p>
             <w:pPr>
@@ -1339,7 +1444,7 @@
         </w:tc>
         <w:tc>
           <w:tcPr>
-            <w:tcW w:type="dxa" w:w="1531"/>
+            <w:tcW w:type="dxa" w:w="737"/>
           </w:tcPr>
           <w:p>
             <w:pPr>
@@ -1353,7 +1458,7 @@
                 <w:i w:val="0"/>
                 <w:sz w:val="20"/>
               </w:rPr>
-              <w:t>Zaharia et al., 2016</w:t>
+              <w:t>[3]</w:t>
             </w:r>
           </w:p>
         </w:tc>
@@ -1379,7 +1484,7 @@
         </w:tc>
         <w:tc>
           <w:tcPr>
-            <w:tcW w:type="dxa" w:w="2948"/>
+            <w:tcW w:type="dxa" w:w="3288"/>
           </w:tcPr>
           <w:p>
             <w:pPr>
@@ -1418,13 +1523,13 @@
                 <w:i w:val="0"/>
                 <w:sz w:val="20"/>
               </w:rPr>
-              <w:t>3</w:t>
+              <w:t>4</w:t>
             </w:r>
           </w:p>
         </w:tc>
         <w:tc>
           <w:tcPr>
-            <w:tcW w:type="dxa" w:w="2211"/>
+            <w:tcW w:type="dxa" w:w="2665"/>
           </w:tcPr>
           <w:p>
             <w:pPr>
@@ -1444,7 +1549,7 @@
         </w:tc>
         <w:tc>
           <w:tcPr>
-            <w:tcW w:type="dxa" w:w="1531"/>
+            <w:tcW w:type="dxa" w:w="737"/>
           </w:tcPr>
           <w:p>
             <w:pPr>
@@ -1458,7 +1563,7 @@
                 <w:i w:val="0"/>
                 <w:sz w:val="20"/>
               </w:rPr>
-              <w:t>Meng et al., 2016</w:t>
+              <w:t>[4]</w:t>
             </w:r>
           </w:p>
         </w:tc>
@@ -1484,7 +1589,7 @@
         </w:tc>
         <w:tc>
           <w:tcPr>
-            <w:tcW w:type="dxa" w:w="2948"/>
+            <w:tcW w:type="dxa" w:w="3288"/>
           </w:tcPr>
           <w:p>
             <w:pPr>
@@ -1523,13 +1628,13 @@
                 <w:i w:val="0"/>
                 <w:sz w:val="20"/>
               </w:rPr>
-              <w:t>4</w:t>
+              <w:t>5</w:t>
             </w:r>
           </w:p>
         </w:tc>
         <w:tc>
           <w:tcPr>
-            <w:tcW w:type="dxa" w:w="2211"/>
+            <w:tcW w:type="dxa" w:w="2665"/>
           </w:tcPr>
           <w:p>
             <w:pPr>
@@ -1543,13 +1648,13 @@
                 <w:i w:val="0"/>
                 <w:sz w:val="20"/>
               </w:rPr>
-              <w:t>PaySim: A Financial Mobile Money Simulator for Fraud Detection</w:t>
+              <w:t>DuckDB: an Embeddable Analytical Database</w:t>
             </w:r>
           </w:p>
         </w:tc>
         <w:tc>
           <w:tcPr>
-            <w:tcW w:type="dxa" w:w="1531"/>
+            <w:tcW w:type="dxa" w:w="737"/>
           </w:tcPr>
           <w:p>
             <w:pPr>
@@ -1563,7 +1668,7 @@
                 <w:i w:val="0"/>
                 <w:sz w:val="20"/>
               </w:rPr>
-              <w:t>Lopez-Rojas, Elmir and Axelsson, 2016</w:t>
+              <w:t>[6]</w:t>
             </w:r>
           </w:p>
         </w:tc>
@@ -1583,13 +1688,13 @@
                 <w:i w:val="0"/>
                 <w:sz w:val="20"/>
               </w:rPr>
-              <w:t>Agent-based simulation</w:t>
+              <w:t>Columnar vectorised engine</w:t>
             </w:r>
           </w:p>
         </w:tc>
         <w:tc>
           <w:tcPr>
-            <w:tcW w:type="dxa" w:w="2948"/>
+            <w:tcW w:type="dxa" w:w="3288"/>
           </w:tcPr>
           <w:p>
             <w:pPr>
@@ -1603,7 +1708,7 @@
                 <w:i w:val="0"/>
                 <w:sz w:val="20"/>
               </w:rPr>
-              <w:t>Source of the 6.36 million-row labelled dataset; fraud appears only in transfer and cash-out transactions.</w:t>
+              <w:t>An in-process analytical database that reads Parquet directly; used for the search index.</w:t>
             </w:r>
           </w:p>
         </w:tc>
@@ -1628,13 +1733,118 @@
                 <w:i w:val="0"/>
                 <w:sz w:val="20"/>
               </w:rPr>
-              <w:t>5</w:t>
+              <w:t>6</w:t>
             </w:r>
           </w:p>
         </w:tc>
         <w:tc>
           <w:tcPr>
-            <w:tcW w:type="dxa" w:w="2211"/>
+            <w:tcW w:type="dxa" w:w="2665"/>
+          </w:tcPr>
+          <w:p>
+            <w:pPr>
+              <w:spacing w:after="40" w:line="240" w:lineRule="auto"/>
+              <w:jc w:val="center"/>
+            </w:pPr>
+            <w:r/>
+            <w:r>
+              <w:rPr>
+                <w:b w:val="0"/>
+                <w:i w:val="0"/>
+                <w:sz w:val="20"/>
+              </w:rPr>
+              <w:t>The Adaptive Radix Tree: ARTful Indexing for Main-Memory Databases</w:t>
+            </w:r>
+          </w:p>
+        </w:tc>
+        <w:tc>
+          <w:tcPr>
+            <w:tcW w:type="dxa" w:w="737"/>
+          </w:tcPr>
+          <w:p>
+            <w:pPr>
+              <w:spacing w:after="40" w:line="240" w:lineRule="auto"/>
+              <w:jc w:val="center"/>
+            </w:pPr>
+            <w:r/>
+            <w:r>
+              <w:rPr>
+                <w:b w:val="0"/>
+                <w:i w:val="0"/>
+                <w:sz w:val="20"/>
+              </w:rPr>
+              <w:t>[7]</w:t>
+            </w:r>
+          </w:p>
+        </w:tc>
+        <w:tc>
+          <w:tcPr>
+            <w:tcW w:type="dxa" w:w="1757"/>
+          </w:tcPr>
+          <w:p>
+            <w:pPr>
+              <w:spacing w:after="40" w:line="240" w:lineRule="auto"/>
+              <w:jc w:val="center"/>
+            </w:pPr>
+            <w:r/>
+            <w:r>
+              <w:rPr>
+                <w:b w:val="0"/>
+                <w:i w:val="0"/>
+                <w:sz w:val="20"/>
+              </w:rPr>
+              <w:t>ART index</w:t>
+            </w:r>
+          </w:p>
+        </w:tc>
+        <w:tc>
+          <w:tcPr>
+            <w:tcW w:type="dxa" w:w="3288"/>
+          </w:tcPr>
+          <w:p>
+            <w:pPr>
+              <w:spacing w:after="40" w:line="240" w:lineRule="auto"/>
+              <w:jc w:val="center"/>
+            </w:pPr>
+            <w:r/>
+            <w:r>
+              <w:rPr>
+                <w:b w:val="0"/>
+                <w:i w:val="0"/>
+                <w:sz w:val="20"/>
+              </w:rPr>
+              <w:t>A tree index supporting exact and prefix lookups; the index type behind the millisecond account search and suggestions.</w:t>
+            </w:r>
+          </w:p>
+        </w:tc>
+      </w:tr>
+      <w:tr>
+        <w:trPr>
+          <w:cantSplit/>
+        </w:trPr>
+        <w:tc>
+          <w:tcPr>
+            <w:tcW w:type="dxa" w:w="624"/>
+          </w:tcPr>
+          <w:p>
+            <w:pPr>
+              <w:spacing w:after="40" w:line="240" w:lineRule="auto"/>
+              <w:jc w:val="center"/>
+            </w:pPr>
+            <w:r/>
+            <w:r>
+              <w:rPr>
+                <w:b w:val="0"/>
+                <w:i w:val="0"/>
+                <w:sz w:val="20"/>
+              </w:rPr>
+              <w:t>7</w:t>
+            </w:r>
+          </w:p>
+        </w:tc>
+        <w:tc>
+          <w:tcPr>
+            <w:tcW w:type="dxa" w:w="2665"/>
           </w:tcPr>
           <w:p>
             <w:pPr>
@@ -1654,7 +1864,7 @@
         </w:tc>
         <w:tc>
           <w:tcPr>
-            <w:tcW w:type="dxa" w:w="1531"/>
+            <w:tcW w:type="dxa" w:w="737"/>
           </w:tcPr>
           <w:p>
             <w:pPr>
@@ -1668,7 +1878,7 @@
                 <w:i w:val="0"/>
                 <w:sz w:val="20"/>
               </w:rPr>
-              <w:t>Chawla et al., 2002</w:t>
+              <w:t>[8]</w:t>
             </w:r>
           </w:p>
         </w:tc>
@@ -1694,7 +1904,7 @@
         </w:tc>
         <w:tc>
           <w:tcPr>
-            <w:tcW w:type="dxa" w:w="2948"/>
+            <w:tcW w:type="dxa" w:w="3288"/>
           </w:tcPr>
           <w:p>
             <w:pPr>
@@ -1733,13 +1943,13 @@
                 <w:i w:val="0"/>
                 <w:sz w:val="20"/>
               </w:rPr>
-              <w:t>6</w:t>
+              <w:t>8</w:t>
             </w:r>
           </w:p>
         </w:tc>
         <w:tc>
           <w:tcPr>
-            <w:tcW w:type="dxa" w:w="2211"/>
+            <w:tcW w:type="dxa" w:w="2665"/>
           </w:tcPr>
           <w:p>
             <w:pPr>
@@ -1753,13 +1963,13 @@
                 <w:i w:val="0"/>
                 <w:sz w:val="20"/>
               </w:rPr>
-              <w:t>The Precision-Recall Plot Is More Informative than the ROC Plot on Imbalanced Datasets</w:t>
+              <w:t>Random Forests</w:t>
             </w:r>
           </w:p>
         </w:tc>
         <w:tc>
           <w:tcPr>
-            <w:tcW w:type="dxa" w:w="1531"/>
+            <w:tcW w:type="dxa" w:w="737"/>
           </w:tcPr>
           <w:p>
             <w:pPr>
@@ -1773,7 +1983,7 @@
                 <w:i w:val="0"/>
                 <w:sz w:val="20"/>
               </w:rPr>
-              <w:t>Saito and Rehmsmeier, 2015</w:t>
+              <w:t>[9]</w:t>
             </w:r>
           </w:p>
         </w:tc>
@@ -1793,13 +2003,13 @@
                 <w:i w:val="0"/>
                 <w:sz w:val="20"/>
               </w:rPr>
-              <w:t>Evaluation metrics</w:t>
+              <w:t>Ensemble of decision trees, bagging</w:t>
             </w:r>
           </w:p>
         </w:tc>
         <w:tc>
           <w:tcPr>
-            <w:tcW w:type="dxa" w:w="2948"/>
+            <w:tcW w:type="dxa" w:w="3288"/>
           </w:tcPr>
           <w:p>
             <w:pPr>
@@ -1813,217 +2023,7 @@
                 <w:i w:val="0"/>
                 <w:sz w:val="20"/>
               </w:rPr>
-              <w:t>Justifies reporting precision, recall and area under the precision-recall curve for rare-class problems.</w:t>
-            </w:r>
-          </w:p>
-        </w:tc>
-      </w:tr>
-      <w:tr>
-        <w:trPr>
-          <w:cantSplit/>
-        </w:trPr>
-        <w:tc>
-          <w:tcPr>
-            <w:tcW w:type="dxa" w:w="624"/>
-          </w:tcPr>
-          <w:p>
-            <w:pPr>
-              <w:spacing w:after="40" w:line="240" w:lineRule="auto"/>
-              <w:jc w:val="center"/>
-            </w:pPr>
-            <w:r/>
-            <w:r>
-              <w:rPr>
-                <w:b w:val="0"/>
-                <w:i w:val="0"/>
-                <w:sz w:val="20"/>
-              </w:rPr>
-              <w:t>7</w:t>
-            </w:r>
-          </w:p>
-        </w:tc>
-        <w:tc>
-          <w:tcPr>
-            <w:tcW w:type="dxa" w:w="2211"/>
-          </w:tcPr>
-          <w:p>
-            <w:pPr>
-              <w:spacing w:after="40" w:line="240" w:lineRule="auto"/>
-              <w:jc w:val="center"/>
-            </w:pPr>
-            <w:r/>
-            <w:r>
-              <w:rPr>
-                <w:b w:val="0"/>
-                <w:i w:val="0"/>
-                <w:sz w:val="20"/>
-              </w:rPr>
-              <w:t>DuckDB: an Embeddable Analytical Database</w:t>
-            </w:r>
-          </w:p>
-        </w:tc>
-        <w:tc>
-          <w:tcPr>
-            <w:tcW w:type="dxa" w:w="1531"/>
-          </w:tcPr>
-          <w:p>
-            <w:pPr>
-              <w:spacing w:after="40" w:line="240" w:lineRule="auto"/>
-              <w:jc w:val="center"/>
-            </w:pPr>
-            <w:r/>
-            <w:r>
-              <w:rPr>
-                <w:b w:val="0"/>
-                <w:i w:val="0"/>
-                <w:sz w:val="20"/>
-              </w:rPr>
-              <w:t>Raasveldt and Muhleisen, 2019</w:t>
-            </w:r>
-          </w:p>
-        </w:tc>
-        <w:tc>
-          <w:tcPr>
-            <w:tcW w:type="dxa" w:w="1757"/>
-          </w:tcPr>
-          <w:p>
-            <w:pPr>
-              <w:spacing w:after="40" w:line="240" w:lineRule="auto"/>
-              <w:jc w:val="center"/>
-            </w:pPr>
-            <w:r/>
-            <w:r>
-              <w:rPr>
-                <w:b w:val="0"/>
-                <w:i w:val="0"/>
-                <w:sz w:val="20"/>
-              </w:rPr>
-              <w:t>Columnar vectorised engine</w:t>
-            </w:r>
-          </w:p>
-        </w:tc>
-        <w:tc>
-          <w:tcPr>
-            <w:tcW w:type="dxa" w:w="2948"/>
-          </w:tcPr>
-          <w:p>
-            <w:pPr>
-              <w:spacing w:after="40" w:line="240" w:lineRule="auto"/>
-              <w:jc w:val="center"/>
-            </w:pPr>
-            <w:r/>
-            <w:r>
-              <w:rPr>
-                <w:b w:val="0"/>
-                <w:i w:val="0"/>
-                <w:sz w:val="20"/>
-              </w:rPr>
-              <w:t>An in-process analytical database that reads Parquet directly; used for the search index.</w:t>
-            </w:r>
-          </w:p>
-        </w:tc>
-      </w:tr>
-      <w:tr>
-        <w:trPr>
-          <w:cantSplit/>
-        </w:trPr>
-        <w:tc>
-          <w:tcPr>
-            <w:tcW w:type="dxa" w:w="624"/>
-          </w:tcPr>
-          <w:p>
-            <w:pPr>
-              <w:spacing w:after="40" w:line="240" w:lineRule="auto"/>
-              <w:jc w:val="center"/>
-            </w:pPr>
-            <w:r/>
-            <w:r>
-              <w:rPr>
-                <w:b w:val="0"/>
-                <w:i w:val="0"/>
-                <w:sz w:val="20"/>
-              </w:rPr>
-              <w:t>8</w:t>
-            </w:r>
-          </w:p>
-        </w:tc>
-        <w:tc>
-          <w:tcPr>
-            <w:tcW w:type="dxa" w:w="2211"/>
-          </w:tcPr>
-          <w:p>
-            <w:pPr>
-              <w:spacing w:after="40" w:line="240" w:lineRule="auto"/>
-              <w:jc w:val="center"/>
-            </w:pPr>
-            <w:r/>
-            <w:r>
-              <w:rPr>
-                <w:b w:val="0"/>
-                <w:i w:val="0"/>
-                <w:sz w:val="20"/>
-              </w:rPr>
-              <w:t>The Adaptive Radix Tree: ARTful Indexing for Main-Memory Databases</w:t>
-            </w:r>
-          </w:p>
-        </w:tc>
-        <w:tc>
-          <w:tcPr>
-            <w:tcW w:type="dxa" w:w="1531"/>
-          </w:tcPr>
-          <w:p>
-            <w:pPr>
-              <w:spacing w:after="40" w:line="240" w:lineRule="auto"/>
-              <w:jc w:val="center"/>
-            </w:pPr>
-            <w:r/>
-            <w:r>
-              <w:rPr>
-                <w:b w:val="0"/>
-                <w:i w:val="0"/>
-                <w:sz w:val="20"/>
-              </w:rPr>
-              <w:t>Leis, Kemper and Neumann, 2013</w:t>
-            </w:r>
-          </w:p>
-        </w:tc>
-        <w:tc>
-          <w:tcPr>
-            <w:tcW w:type="dxa" w:w="1757"/>
-          </w:tcPr>
-          <w:p>
-            <w:pPr>
-              <w:spacing w:after="40" w:line="240" w:lineRule="auto"/>
-              <w:jc w:val="center"/>
-            </w:pPr>
-            <w:r/>
-            <w:r>
-              <w:rPr>
-                <w:b w:val="0"/>
-                <w:i w:val="0"/>
-                <w:sz w:val="20"/>
-              </w:rPr>
-              <w:t>ART index</w:t>
-            </w:r>
-          </w:p>
-        </w:tc>
-        <w:tc>
-          <w:tcPr>
-            <w:tcW w:type="dxa" w:w="2948"/>
-          </w:tcPr>
-          <w:p>
-            <w:pPr>
-              <w:spacing w:after="40" w:line="240" w:lineRule="auto"/>
-              <w:jc w:val="center"/>
-            </w:pPr>
-            <w:r/>
-            <w:r>
-              <w:rPr>
-                <w:b w:val="0"/>
-                <w:i w:val="0"/>
-                <w:sz w:val="20"/>
-              </w:rPr>
-              <w:t>A tree index supporting exact and prefix lookups; the index type behind the millisecond account search and suggestions.</w:t>
+              <w:t>Showed that averaging many randomised trees gives accurate, robust classifiers; forms the core of the proposed fraud model.</w:t>
             </w:r>
           </w:p>
         </w:tc>
@@ -2329,7 +2329,7 @@
           <w:b w:val="0"/>
           <w:i w:val="0"/>
         </w:rPr>
-        <w:t xml:space="preserve"> The main dataset is PaySim, published on Kaggle. It contains 6,362,604 simulated mobile-money transactions over 31 days (744 hourly steps). It is labelled: each row carries an isFraud flag, and the dataset also contains a simple built-in rule flag. The raw file (471 MB) is cleaned and converted into a 304 MB Parquet data lake partitioned by transaction type. No values are missing and there are no duplicate rows; 16 rows with an amount of zero were removed during ingestion.</w:t>
+        <w:t xml:space="preserve"> The main dataset is PaySim [1], published on Kaggle. It contains 6,362,604 simulated mobile-money transactions over 31 days (744 hourly steps). It is labelled: each row carries an isFraud flag, and the dataset also contains a simple built-in rule flag. The raw file (471 MB) is cleaned and converted into a 304 MB Parquet data lake partitioned by transaction type. No values are missing and there are no duplicate rows; 16 rows with an amount of zero were removed during ingestion.</w:t>
       </w:r>
     </w:p>
     <w:p>
@@ -3359,7 +3359,7 @@
                 <w:i w:val="0"/>
                 <w:sz w:val="21"/>
               </w:rPr>
-              <w:t>Apache Spark (PySpark, Spark SQL)</w:t>
+              <w:t>Apache Spark (PySpark, Spark SQL) [10]</w:t>
             </w:r>
           </w:p>
         </w:tc>
@@ -3424,7 +3424,7 @@
                 <w:i w:val="0"/>
                 <w:sz w:val="21"/>
               </w:rPr>
-              <w:t>Spark MLlib</w:t>
+              <w:t>Spark MLlib [4]</w:t>
             </w:r>
           </w:p>
         </w:tc>
@@ -3489,7 +3489,7 @@
                 <w:i w:val="0"/>
                 <w:sz w:val="21"/>
               </w:rPr>
-              <w:t>Parquet files</w:t>
+              <w:t>Parquet files [11]</w:t>
             </w:r>
           </w:p>
         </w:tc>
@@ -3554,7 +3554,7 @@
                 <w:i w:val="0"/>
                 <w:sz w:val="21"/>
               </w:rPr>
-              <w:t>DuckDB with ART indexes</w:t>
+              <w:t>DuckDB with ART indexes [12], [7]</w:t>
             </w:r>
           </w:p>
         </w:tc>
@@ -3619,7 +3619,7 @@
                 <w:i w:val="0"/>
                 <w:sz w:val="21"/>
               </w:rPr>
-              <w:t>MongoDB</w:t>
+              <w:t>MongoDB [13]</w:t>
             </w:r>
           </w:p>
         </w:tc>
@@ -3684,7 +3684,7 @@
                 <w:i w:val="0"/>
                 <w:sz w:val="21"/>
               </w:rPr>
-              <w:t>FastAPI, Pydantic</w:t>
+              <w:t>FastAPI, Pydantic [14]</w:t>
             </w:r>
           </w:p>
         </w:tc>
@@ -6861,11 +6861,107 @@
     <w:p>
       <w:pPr>
         <w:spacing w:after="120"/>
-        <w:ind w:left="510" w:hanging="510"/>
+        <w:ind w:left="624" w:hanging="624"/>
         <w:jc w:val="both"/>
       </w:pPr>
       <w:r>
-        <w:t>1.</w:t>
+        <w:t>[1]</w:t>
+        <w:tab/>
+        <w:t>E. A. Lopez-Rojas, A. Elmir and S. Axelsson, "PaySim: A financial mobile money simulator for fraud detection," in Proc. 28th European Modeling and Simulation Symposium (EMSS), 2016. [Online]. Available: https://www.kaggle.com/datasets/ealaxi/paysim1</w:t>
+      </w:r>
+    </w:p>
+    <w:p>
+      <w:pPr>
+        <w:spacing w:after="120"/>
+        <w:ind w:left="624" w:hanging="624"/>
+        <w:jc w:val="both"/>
+      </w:pPr>
+      <w:r>
+        <w:t>[2]</w:t>
+        <w:tab/>
+        <w:t>T. Saito and M. Rehmsmeier, "The Precision-Recall Plot Is More Informative than the ROC Plot When Evaluating Binary Classifiers on Imbalanced Datasets," PLoS ONE, vol. 10, no. 3, p. e0118432, 2015.</w:t>
+      </w:r>
+    </w:p>
+    <w:p>
+      <w:pPr>
+        <w:spacing w:after="120"/>
+        <w:ind w:left="624" w:hanging="624"/>
+        <w:jc w:val="both"/>
+      </w:pPr>
+      <w:r>
+        <w:t>[3]</w:t>
+        <w:tab/>
+        <w:t>M. Zaharia et al., "Apache Spark: A Unified Engine for Big Data Processing," Communications of the ACM, vol. 59, no. 11, pp. 56-65, 2016.</w:t>
+      </w:r>
+    </w:p>
+    <w:p>
+      <w:pPr>
+        <w:spacing w:after="120"/>
+        <w:ind w:left="624" w:hanging="624"/>
+        <w:jc w:val="both"/>
+      </w:pPr>
+      <w:r>
+        <w:t>[4]</w:t>
+        <w:tab/>
+        <w:t>X. Meng et al., "MLlib: Machine Learning in Apache Spark," Journal of Machine Learning Research, vol. 17, no. 34, pp. 1-7, 2016.</w:t>
+      </w:r>
+    </w:p>
+    <w:p>
+      <w:pPr>
+        <w:spacing w:after="120"/>
+        <w:ind w:left="624" w:hanging="624"/>
+        <w:jc w:val="both"/>
+      </w:pPr>
+      <w:r>
+        <w:t>[5]</w:t>
+        <w:tab/>
+        <w:t>Machine Learning Group, Universite Libre de Bruxelles, "Credit Card Fraud Detection," Kaggle dataset. [Online]. Available: https://www.kaggle.com/datasets/mlg-ulb/creditcardfraud</w:t>
+      </w:r>
+    </w:p>
+    <w:p>
+      <w:pPr>
+        <w:spacing w:after="120"/>
+        <w:ind w:left="624" w:hanging="624"/>
+        <w:jc w:val="both"/>
+      </w:pPr>
+      <w:r>
+        <w:t>[6]</w:t>
+        <w:tab/>
+        <w:t>M. Raasveldt and H. Muhleisen, "DuckDB: an Embeddable Analytical Database," in Proc. ACM SIGMOD International Conference on Management of Data, 2019, pp. 1981-1984.</w:t>
+      </w:r>
+    </w:p>
+    <w:p>
+      <w:pPr>
+        <w:spacing w:after="120"/>
+        <w:ind w:left="624" w:hanging="624"/>
+        <w:jc w:val="both"/>
+      </w:pPr>
+      <w:r>
+        <w:t>[7]</w:t>
+        <w:tab/>
+        <w:t>V. Leis, A. Kemper and T. Neumann, "The Adaptive Radix Tree: ARTful Indexing for Main-Memory Databases," in Proc. IEEE 29th International Conference on Data Engineering (ICDE), 2013.</w:t>
+      </w:r>
+    </w:p>
+    <w:p>
+      <w:pPr>
+        <w:spacing w:after="120"/>
+        <w:ind w:left="624" w:hanging="624"/>
+        <w:jc w:val="both"/>
+      </w:pPr>
+      <w:r>
+        <w:t>[8]</w:t>
+        <w:tab/>
+        <w:t>N. V. Chawla, K. W. Bowyer, L. O. Hall and W. P. Kegelmeyer, "SMOTE: Synthetic Minority Over-sampling Technique," Journal of Artificial Intelligence Research, vol. 16, pp. 321-357, 2002.</w:t>
+      </w:r>
+    </w:p>
+    <w:p>
+      <w:pPr>
+        <w:spacing w:after="120"/>
+        <w:ind w:left="624" w:hanging="624"/>
+        <w:jc w:val="both"/>
+      </w:pPr>
+      <w:r>
+        <w:t>[9]</w:t>
         <w:tab/>
         <w:t>L. Breiman, "Random Forests," Machine Learning, vol. 45, no. 1, pp. 5-32, 2001.</w:t>
       </w:r>
@@ -6873,145 +6969,61 @@
     <w:p>
       <w:pPr>
         <w:spacing w:after="120"/>
-        <w:ind w:left="510" w:hanging="510"/>
+        <w:ind w:left="624" w:hanging="624"/>
         <w:jc w:val="both"/>
       </w:pPr>
       <w:r>
-        <w:t>2.</w:t>
+        <w:t>[10]</w:t>
         <w:tab/>
-        <w:t>M. Zaharia et al., "Apache Spark: A Unified Engine for Big Data Processing," Communications of the ACM, vol. 59, no. 11, pp. 56-65, 2016.</w:t>
+        <w:t>Apache Software Foundation, "Apache Spark Documentation: Spark SQL and MLlib guides." [Online]. Available: https://spark.apache.org/docs/latest/</w:t>
       </w:r>
     </w:p>
     <w:p>
       <w:pPr>
         <w:spacing w:after="120"/>
-        <w:ind w:left="510" w:hanging="510"/>
+        <w:ind w:left="624" w:hanging="624"/>
         <w:jc w:val="both"/>
       </w:pPr>
       <w:r>
-        <w:t>3.</w:t>
+        <w:t>[11]</w:t>
         <w:tab/>
-        <w:t>X. Meng et al., "MLlib: Machine Learning in Apache Spark," Journal of Machine Learning Research, vol. 17, no. 34, pp. 1-7, 2016.</w:t>
+        <w:t>Apache Software Foundation, "Apache Parquet Documentation." [Online]. Available: https://parquet.apache.org/docs/</w:t>
       </w:r>
     </w:p>
     <w:p>
       <w:pPr>
         <w:spacing w:after="120"/>
-        <w:ind w:left="510" w:hanging="510"/>
+        <w:ind w:left="624" w:hanging="624"/>
         <w:jc w:val="both"/>
       </w:pPr>
       <w:r>
-        <w:t>4.</w:t>
+        <w:t>[12]</w:t>
         <w:tab/>
-        <w:t>E. A. Lopez-Rojas, A. Elmir and S. Axelsson, "PaySim: A financial mobile money simulator for fraud detection," in Proc. 28th European Modeling and Simulation Symposium (EMSS), 2016. Dataset available at: https://www.kaggle.com/datasets/ealaxi/paysim1</w:t>
+        <w:t>DuckDB Foundation, "DuckDB Documentation." [Online]. Available: https://duckdb.org/docs/</w:t>
       </w:r>
     </w:p>
     <w:p>
       <w:pPr>
         <w:spacing w:after="120"/>
-        <w:ind w:left="510" w:hanging="510"/>
+        <w:ind w:left="624" w:hanging="624"/>
         <w:jc w:val="both"/>
       </w:pPr>
       <w:r>
-        <w:t>5.</w:t>
+        <w:t>[13]</w:t>
         <w:tab/>
-        <w:t>N. V. Chawla, K. W. Bowyer, L. O. Hall and W. P. Kegelmeyer, "SMOTE: Synthetic Minority Over-sampling Technique," Journal of Artificial Intelligence Research, vol. 16, pp. 321-357, 2002.</w:t>
+        <w:t>MongoDB, Inc., "MongoDB Manual: Indexes (TTL and partial indexes)." [Online]. Available: https://www.mongodb.com/docs/manual/indexes/</w:t>
       </w:r>
     </w:p>
     <w:p>
       <w:pPr>
         <w:spacing w:after="120"/>
-        <w:ind w:left="510" w:hanging="510"/>
+        <w:ind w:left="624" w:hanging="624"/>
         <w:jc w:val="both"/>
       </w:pPr>
       <w:r>
-        <w:t>6.</w:t>
+        <w:t>[14]</w:t>
         <w:tab/>
-        <w:t>T. Saito and M. Rehmsmeier, "The Precision-Recall Plot Is More Informative than the ROC Plot When Evaluating Binary Classifiers on Imbalanced Datasets," PLoS ONE, vol. 10, no. 3, 2015.</w:t>
-      </w:r>
-    </w:p>
-    <w:p>
-      <w:pPr>
-        <w:spacing w:after="120"/>
-        <w:ind w:left="510" w:hanging="510"/>
-        <w:jc w:val="both"/>
-      </w:pPr>
-      <w:r>
-        <w:t>7.</w:t>
-        <w:tab/>
-        <w:t>M. Raasveldt and H. Muhleisen, "DuckDB: an Embeddable Analytical Database," in Proc. ACM SIGMOD International Conference on Management of Data, 2019.</w:t>
-      </w:r>
-    </w:p>
-    <w:p>
-      <w:pPr>
-        <w:spacing w:after="120"/>
-        <w:ind w:left="510" w:hanging="510"/>
-        <w:jc w:val="both"/>
-      </w:pPr>
-      <w:r>
-        <w:t>8.</w:t>
-        <w:tab/>
-        <w:t>V. Leis, A. Kemper and T. Neumann, "The Adaptive Radix Tree: ARTful Indexing for Main-Memory Databases," in Proc. IEEE 29th International Conference on Data Engineering (ICDE), 2013.</w:t>
-      </w:r>
-    </w:p>
-    <w:p>
-      <w:pPr>
-        <w:spacing w:after="120"/>
-        <w:ind w:left="510" w:hanging="510"/>
-        <w:jc w:val="both"/>
-      </w:pPr>
-      <w:r>
-        <w:t>9.</w:t>
-        <w:tab/>
-        <w:t>Apache Spark Documentation, Spark SQL and MLlib guides. Available at: https://spark.apache.org/docs/latest/</w:t>
-      </w:r>
-    </w:p>
-    <w:p>
-      <w:pPr>
-        <w:spacing w:after="120"/>
-        <w:ind w:left="510" w:hanging="510"/>
-        <w:jc w:val="both"/>
-      </w:pPr>
-      <w:r>
-        <w:t>10.</w:t>
-        <w:tab/>
-        <w:t>Apache Parquet Documentation. Available at: https://parquet.apache.org/docs/</w:t>
-      </w:r>
-    </w:p>
-    <w:p>
-      <w:pPr>
-        <w:spacing w:after="120"/>
-        <w:ind w:left="510" w:hanging="510"/>
-        <w:jc w:val="both"/>
-      </w:pPr>
-      <w:r>
-        <w:t>11.</w:t>
-        <w:tab/>
-        <w:t>MongoDB Documentation, Indexes: TTL and partial indexes. Available at: https://www.mongodb.com/docs/manual/indexes/</w:t>
-      </w:r>
-    </w:p>
-    <w:p>
-      <w:pPr>
-        <w:spacing w:after="120"/>
-        <w:ind w:left="510" w:hanging="510"/>
-        <w:jc w:val="both"/>
-      </w:pPr>
-      <w:r>
-        <w:t>12.</w:t>
-        <w:tab/>
-        <w:t>FastAPI Documentation. Available at: https://fastapi.tiangolo.com/</w:t>
-      </w:r>
-    </w:p>
-    <w:p>
-      <w:pPr>
-        <w:spacing w:after="120"/>
-        <w:ind w:left="510" w:hanging="510"/>
-        <w:jc w:val="both"/>
-      </w:pPr>
-      <w:r>
-        <w:t>13.</w:t>
-        <w:tab/>
-        <w:t>DuckDB Documentation. Available at: https://duckdb.org/docs/</w:t>
+        <w:t>S. Ramirez, "FastAPI Documentation." [Online]. Available: https://fastapi.tiangolo.com/</w:t>
       </w:r>
     </w:p>
     <w:sectPr>

</xml_diff>